<commit_message>
made adjustments to petition form and next steps, completed section 1 punch list
</commit_message>
<xml_diff>
--- a/docassemble/MwtPetitionForHarassmentProtect/data/templates/mwt_petition_for_harassment_protect.docx
+++ b/docassemble/MwtPetitionForHarassmentProtect/data/templates/mwt_petition_for_harassment_protect.docx
@@ -55,7 +55,19 @@
         <w:rPr>
           <w:rFonts w:ascii="Aptos" w:eastAsia="Aptos" w:hAnsi="Aptos" w:cs="Aptos"/>
         </w:rPr>
-        <w:t>Under Mashpee Wampanoag Tribal Law (20__-ORD-00_, Harassment &amp; Domestic Abuse Protection Order Ordinance) anyone who has been harassed can petition to the Tribal Court for a Harassment Protection Order. A Harassment Protection Order is a court order that helps stop the harassment or abuse and protects your safety, peace, and well-being. These orders are enforced by Tribal Police and other law-enforcement agencies.</w:t>
+        <w:t xml:space="preserve">Under Mashpee Wampanoag Tribal Law (20__-ORD-00_, Harassment &amp; Domestic Abuse Protection Order Ordinance) anyone who has been harassed can petition to the Tribal Court for a Harassment Protection Order. A Harassment Protection Order is a court order that helps stop the harassment or abuse and protects your safety, peace, and well-being. These orders are enforced by Tribal Police and other </w:t>
+      </w:r>
+      <w:r>
+        <w:rPr>
+          <w:rFonts w:ascii="Aptos" w:eastAsia="Aptos" w:hAnsi="Aptos" w:cs="Aptos"/>
+        </w:rPr>
+        <w:t>law enforcement</w:t>
+      </w:r>
+      <w:r>
+        <w:rPr>
+          <w:rFonts w:ascii="Aptos" w:eastAsia="Aptos" w:hAnsi="Aptos" w:cs="Aptos"/>
+        </w:rPr>
+        <w:t xml:space="preserve"> agencies.</w:t>
       </w:r>
     </w:p>
     <w:p>
@@ -95,79 +107,28 @@
         <w:rPr>
           <w:rFonts w:ascii="Aptos" w:eastAsia="Aptos" w:hAnsi="Aptos" w:cs="Aptos"/>
         </w:rPr>
-        <w:t>Unlawful harassment means without lawful authority, knowingly threatening:</w:t>
-      </w:r>
-    </w:p>
-    <w:p>
-      <w:pPr>
-        <w:pStyle w:val="ListParagraph"/>
-        <w:numPr>
-          <w:ilvl w:val="0"/>
-          <w:numId w:val="3"/>
-        </w:numPr>
-        <w:rPr>
-          <w:rFonts w:ascii="Aptos" w:eastAsia="Aptos" w:hAnsi="Aptos" w:cs="Aptos"/>
-        </w:rPr>
-      </w:pPr>
-      <w:r>
-        <w:rPr>
-          <w:rFonts w:ascii="Aptos" w:eastAsia="Aptos" w:hAnsi="Aptos" w:cs="Aptos"/>
-        </w:rPr>
-        <w:t>to cause bodily injury immediately or in the future to the person threatened or to any other person;</w:t>
-      </w:r>
-    </w:p>
-    <w:p>
-      <w:pPr>
-        <w:pStyle w:val="ListParagraph"/>
-        <w:numPr>
-          <w:ilvl w:val="0"/>
-          <w:numId w:val="3"/>
-        </w:numPr>
-        <w:rPr>
-          <w:rFonts w:ascii="Aptos" w:eastAsia="Aptos" w:hAnsi="Aptos" w:cs="Aptos"/>
-        </w:rPr>
-      </w:pPr>
-      <w:r>
-        <w:rPr>
-          <w:rFonts w:ascii="Aptos" w:eastAsia="Aptos" w:hAnsi="Aptos" w:cs="Aptos"/>
-        </w:rPr>
-        <w:t xml:space="preserve">to cause physical damage to the property of another person; or </w:t>
-      </w:r>
-    </w:p>
-    <w:p>
-      <w:pPr>
-        <w:pStyle w:val="ListParagraph"/>
-        <w:numPr>
-          <w:ilvl w:val="0"/>
-          <w:numId w:val="3"/>
-        </w:numPr>
-        <w:rPr>
-          <w:rFonts w:ascii="Aptos" w:eastAsia="Aptos" w:hAnsi="Aptos" w:cs="Aptos"/>
-        </w:rPr>
-      </w:pPr>
-      <w:r>
-        <w:rPr>
-          <w:rFonts w:ascii="Aptos" w:eastAsia="Aptos" w:hAnsi="Aptos" w:cs="Aptos"/>
-        </w:rPr>
-        <w:t xml:space="preserve">to subject the person threatened or any other person to physical confinement or restraint; or </w:t>
-      </w:r>
-    </w:p>
-    <w:p>
-      <w:pPr>
-        <w:pStyle w:val="ListParagraph"/>
-        <w:numPr>
-          <w:ilvl w:val="0"/>
-          <w:numId w:val="3"/>
-        </w:numPr>
-        <w:rPr>
-          <w:rFonts w:ascii="Aptos" w:eastAsia="Aptos" w:hAnsi="Aptos" w:cs="Aptos"/>
-        </w:rPr>
-      </w:pPr>
-      <w:r>
-        <w:rPr>
-          <w:rFonts w:ascii="Aptos" w:eastAsia="Aptos" w:hAnsi="Aptos" w:cs="Aptos"/>
-        </w:rPr>
-        <w:t xml:space="preserve"> maliciously to do any other act which is intended to substantially harm the person threatened or another with respect to his or her physical or mental health or safety.</w:t>
+        <w:t xml:space="preserve">Unlawful harassment means </w:t>
+      </w:r>
+      <w:r>
+        <w:t>a course of conduct engaged in with the intent to torment</w:t>
+      </w:r>
+      <w:r>
+        <w:t>,</w:t>
+      </w:r>
+      <w:r>
+        <w:t xml:space="preserve"> threaten</w:t>
+      </w:r>
+      <w:r>
+        <w:t>, or intimidate</w:t>
+      </w:r>
+      <w:r>
+        <w:t xml:space="preserve"> another person. </w:t>
+      </w:r>
+      <w:r>
+        <w:t>This course of conduct</w:t>
+      </w:r>
+      <w:r>
+        <w:t xml:space="preserve"> can be verbal or nonverbal, and includes any repeated intrusive or unwanted acts, words, gestures, or any similar acts that are intended to affect the safety, security, or privacy of another person adversely and unlawfully</w:t>
       </w:r>
     </w:p>
     <w:p>
@@ -266,16 +227,10 @@
     <w:p>
       <w:pPr>
         <w:ind w:left="720"/>
-        <w:rPr>
-          <w:sz w:val="22"/>
-          <w:szCs w:val="22"/>
-        </w:rPr>
-      </w:pPr>
-      <w:r>
-        <w:rPr>
-          <w:rFonts w:ascii="Aptos" w:eastAsia="Aptos" w:hAnsi="Aptos" w:cs="Aptos"/>
-          <w:sz w:val="22"/>
-          <w:szCs w:val="22"/>
+      </w:pPr>
+      <w:r>
+        <w:rPr>
+          <w:rFonts w:ascii="Aptos" w:eastAsia="Aptos" w:hAnsi="Aptos" w:cs="Aptos"/>
         </w:rPr>
         <w:t>An Ex Parte Order is a temporary order issued by the Tribal Court when only one party is present. It provides short-term protection until a hearing can be held, where both parties will have the opportunity to be heard. Any orders granted under this system are certified by the Court Clerk on the next business day.</w:t>
       </w:r>
@@ -371,7 +326,19 @@
         <w:rPr>
           <w:rFonts w:ascii="Aptos" w:eastAsia="Aptos" w:hAnsi="Aptos" w:cs="Aptos"/>
         </w:rPr>
-        <w:t>A minor who is 16 years of age or older, or who is legally emancipated.</w:t>
+        <w:t>A minor</w:t>
+      </w:r>
+      <w:r>
+        <w:rPr>
+          <w:rFonts w:ascii="Aptos" w:eastAsia="Aptos" w:hAnsi="Aptos" w:cs="Aptos"/>
+        </w:rPr>
+        <w:t xml:space="preserve"> </w:t>
+      </w:r>
+      <w:r>
+        <w:rPr>
+          <w:rFonts w:ascii="Aptos" w:eastAsia="Aptos" w:hAnsi="Aptos" w:cs="Aptos"/>
+        </w:rPr>
+        <w:t>who is legally emancipated.</w:t>
       </w:r>
     </w:p>
     <w:p>
@@ -421,7 +388,6 @@
         <w:rPr>
           <w:rFonts w:ascii="Aptos" w:eastAsia="Aptos" w:hAnsi="Aptos" w:cs="Aptos"/>
         </w:rPr>
-        <w:lastRenderedPageBreak/>
         <w:t>If either you or the Defendant is under 18 years old, you must indicate this by selecting the appropriate option on the form.</w:t>
       </w:r>
     </w:p>
@@ -457,6 +423,7 @@
         <w:rPr>
           <w:rFonts w:ascii="Aptos" w:eastAsia="Aptos" w:hAnsi="Aptos" w:cs="Aptos"/>
         </w:rPr>
+        <w:lastRenderedPageBreak/>
         <w:t xml:space="preserve"> </w:t>
       </w:r>
     </w:p>
@@ -489,7 +456,19 @@
         <w:rPr>
           <w:rFonts w:ascii="Aptos" w:eastAsia="Aptos" w:hAnsi="Aptos" w:cs="Aptos"/>
         </w:rPr>
-        <w:t>You may also ask the Judge to order the Defendant to compensate you for financial losses caused by the harassment. These may include:</w:t>
+        <w:t xml:space="preserve">You may also ask the </w:t>
+      </w:r>
+      <w:r>
+        <w:rPr>
+          <w:rFonts w:ascii="Aptos" w:eastAsia="Aptos" w:hAnsi="Aptos" w:cs="Aptos"/>
+        </w:rPr>
+        <w:t xml:space="preserve">Tribal </w:t>
+      </w:r>
+      <w:r>
+        <w:rPr>
+          <w:rFonts w:ascii="Aptos" w:eastAsia="Aptos" w:hAnsi="Aptos" w:cs="Aptos"/>
+        </w:rPr>
+        <w:t>Judge to order the Defendant to compensate you for financial losses caused by the harassment. These may include:</w:t>
       </w:r>
     </w:p>
     <w:p>
@@ -913,7 +892,6 @@
         <w:rPr>
           <w:rFonts w:ascii="Aptos" w:eastAsia="Aptos" w:hAnsi="Aptos" w:cs="Aptos"/>
         </w:rPr>
-        <w:lastRenderedPageBreak/>
         <w:t xml:space="preserve"> Describe in detail what happened, including the specific acts or behaviors that made you feel threatened, intimidated, or unsafe.</w:t>
       </w:r>
     </w:p>
@@ -944,7 +922,19 @@
         <w:rPr>
           <w:rFonts w:ascii="Aptos" w:eastAsia="Aptos" w:hAnsi="Aptos" w:cs="Aptos"/>
         </w:rPr>
-        <w:t xml:space="preserve"> to helps law enforcement locate the Defendant and serve (deliver) the Court Order if one is issued</w:t>
+        <w:t xml:space="preserve"> to helps law enforcement locate the Defendant and serve (deliver) the</w:t>
+      </w:r>
+      <w:r>
+        <w:rPr>
+          <w:rFonts w:ascii="Aptos" w:eastAsia="Aptos" w:hAnsi="Aptos" w:cs="Aptos"/>
+        </w:rPr>
+        <w:t xml:space="preserve"> Tribal</w:t>
+      </w:r>
+      <w:r>
+        <w:rPr>
+          <w:rFonts w:ascii="Aptos" w:eastAsia="Aptos" w:hAnsi="Aptos" w:cs="Aptos"/>
+        </w:rPr>
+        <w:t xml:space="preserve"> Court Order if one is issued</w:t>
       </w:r>
     </w:p>
     <w:p>
@@ -962,6 +952,7 @@
         <w:rPr>
           <w:rFonts w:ascii="Aptos" w:eastAsia="Aptos" w:hAnsi="Aptos" w:cs="Aptos"/>
         </w:rPr>
+        <w:lastRenderedPageBreak/>
         <w:t>You may request that your personal information be kept confidential.</w:t>
       </w:r>
     </w:p>
@@ -980,7 +971,31 @@
         <w:rPr>
           <w:rFonts w:ascii="Aptos" w:eastAsia="Aptos" w:hAnsi="Aptos" w:cs="Aptos"/>
         </w:rPr>
-        <w:t>If you ask the Court to order the Defendant to remain away from your residence or workplace, those addresses will appear in the Court Order so that law enforcement can enforce it.</w:t>
+        <w:t xml:space="preserve">If you ask the </w:t>
+      </w:r>
+      <w:r>
+        <w:rPr>
+          <w:rFonts w:ascii="Aptos" w:eastAsia="Aptos" w:hAnsi="Aptos" w:cs="Aptos"/>
+        </w:rPr>
+        <w:t xml:space="preserve">Tribal </w:t>
+      </w:r>
+      <w:r>
+        <w:rPr>
+          <w:rFonts w:ascii="Aptos" w:eastAsia="Aptos" w:hAnsi="Aptos" w:cs="Aptos"/>
+        </w:rPr>
+        <w:t xml:space="preserve">Court to order the Defendant to remain away from your residence or workplace, those addresses will appear in the </w:t>
+      </w:r>
+      <w:r>
+        <w:rPr>
+          <w:rFonts w:ascii="Aptos" w:eastAsia="Aptos" w:hAnsi="Aptos" w:cs="Aptos"/>
+        </w:rPr>
+        <w:t xml:space="preserve">Tribal </w:t>
+      </w:r>
+      <w:r>
+        <w:rPr>
+          <w:rFonts w:ascii="Aptos" w:eastAsia="Aptos" w:hAnsi="Aptos" w:cs="Aptos"/>
+        </w:rPr>
+        <w:t>Court Order so that law enforcement can enforce it.</w:t>
       </w:r>
     </w:p>
     <w:p>
@@ -998,7 +1013,19 @@
         <w:rPr>
           <w:rFonts w:ascii="Aptos" w:eastAsia="Aptos" w:hAnsi="Aptos" w:cs="Aptos"/>
         </w:rPr>
-        <w:t>If you do not want those addresses to appear in the Court Order and be disclosed to the Defendant, you must specifically request that they be omitted for safety reasons.</w:t>
+        <w:t xml:space="preserve">If you do not want those addresses to appear in the </w:t>
+      </w:r>
+      <w:r>
+        <w:rPr>
+          <w:rFonts w:ascii="Aptos" w:eastAsia="Aptos" w:hAnsi="Aptos" w:cs="Aptos"/>
+        </w:rPr>
+        <w:t xml:space="preserve">Tribal </w:t>
+      </w:r>
+      <w:r>
+        <w:rPr>
+          <w:rFonts w:ascii="Aptos" w:eastAsia="Aptos" w:hAnsi="Aptos" w:cs="Aptos"/>
+        </w:rPr>
+        <w:t>Court Order and be disclosed to the Defendant, you must specifically request that they be omitted for safety reasons.</w:t>
       </w:r>
     </w:p>
     <w:p>
@@ -1015,72 +1042,49 @@
       <w:r>
         <w:rPr>
           <w:rFonts w:ascii="Aptos" w:eastAsia="Aptos" w:hAnsi="Aptos" w:cs="Aptos"/>
-        </w:rPr>
-        <w:t>Electronically sign and date the statement to confirm that everything you have written is true and accurate to the best of your knowledge.</w:t>
+          <w:b/>
+          <w:bCs/>
+        </w:rPr>
+        <w:t>Electronically sign and date</w:t>
+      </w:r>
+      <w:r>
+        <w:rPr>
+          <w:rFonts w:ascii="Aptos" w:eastAsia="Aptos" w:hAnsi="Aptos" w:cs="Aptos"/>
+        </w:rPr>
+        <w:t xml:space="preserve"> the form which confirms that everything you have written is true and accurate to the best of your knowledge.</w:t>
       </w:r>
     </w:p>
     <w:p>
-      <w:pPr>
-        <w:pStyle w:val="ListParagraph"/>
-        <w:numPr>
-          <w:ilvl w:val="0"/>
-          <w:numId w:val="5"/>
-        </w:numPr>
-        <w:rPr>
-          <w:rFonts w:ascii="Aptos" w:eastAsia="Aptos" w:hAnsi="Aptos" w:cs="Aptos"/>
-        </w:rPr>
-      </w:pPr>
-      <w:r>
-        <w:rPr>
-          <w:rFonts w:ascii="Aptos" w:eastAsia="Aptos" w:hAnsi="Aptos" w:cs="Aptos"/>
-        </w:rPr>
-        <w:t>Pay the Filing Fees if applicable</w:t>
+      <w:r>
+        <w:rPr>
+          <w:rFonts w:ascii="Aptos" w:eastAsia="Aptos" w:hAnsi="Aptos" w:cs="Aptos"/>
+          <w:b/>
+          <w:bCs/>
+        </w:rPr>
+        <w:t xml:space="preserve"> </w:t>
       </w:r>
     </w:p>
     <w:p>
-      <w:pPr>
-        <w:pStyle w:val="ListParagraph"/>
-        <w:numPr>
-          <w:ilvl w:val="0"/>
-          <w:numId w:val="5"/>
-        </w:numPr>
-        <w:rPr>
-          <w:rFonts w:ascii="Aptos" w:eastAsia="Aptos" w:hAnsi="Aptos" w:cs="Aptos"/>
-        </w:rPr>
-      </w:pPr>
       <w:r>
         <w:rPr>
           <w:rFonts w:ascii="Aptos" w:eastAsia="Aptos" w:hAnsi="Aptos" w:cs="Aptos"/>
           <w:b/>
           <w:bCs/>
         </w:rPr>
-        <w:t>Electronically sign and date</w:t>
-      </w:r>
-      <w:r>
-        <w:rPr>
-          <w:rFonts w:ascii="Aptos" w:eastAsia="Aptos" w:hAnsi="Aptos" w:cs="Aptos"/>
-        </w:rPr>
-        <w:t xml:space="preserve"> the form which confirms that everything you have written is true and accurate to the best of your knowledge.</w:t>
+        <w:t xml:space="preserve">Confidentiality and Sealing of Records </w:t>
       </w:r>
     </w:p>
     <w:p>
       <w:r>
-        <w:rPr>
-          <w:rFonts w:ascii="Aptos" w:eastAsia="Aptos" w:hAnsi="Aptos" w:cs="Aptos"/>
-          <w:b/>
-          <w:bCs/>
-        </w:rPr>
-        <w:t xml:space="preserve"> </w:t>
+        <w:t>If you believe that sharing your residential address could put your health, safety, or liberty at risk, you may ask to have that information sealed and provide a different mailing address instead. The court will still require your residential address in order to process your case.</w:t>
       </w:r>
     </w:p>
     <w:p>
       <w:r>
         <w:rPr>
           <w:rFonts w:ascii="Aptos" w:eastAsia="Aptos" w:hAnsi="Aptos" w:cs="Aptos"/>
-          <w:b/>
-          <w:bCs/>
-        </w:rPr>
-        <w:t xml:space="preserve">Confidentiality and Sealing of Records </w:t>
+        </w:rPr>
+        <w:t xml:space="preserve"> </w:t>
       </w:r>
     </w:p>
     <w:p>
@@ -1088,23 +1092,31 @@
         <w:rPr>
           <w:rFonts w:ascii="Aptos" w:eastAsia="Aptos" w:hAnsi="Aptos" w:cs="Aptos"/>
         </w:rPr>
-        <w:t>If you believe that sharing your address, phone number, or personal information could endanger your health, safety, or liberty, you may request that your information be sealed.</w:t>
-      </w:r>
-    </w:p>
-    <w:p>
-      <w:r>
-        <w:rPr>
-          <w:rFonts w:ascii="Aptos" w:eastAsia="Aptos" w:hAnsi="Aptos" w:cs="Aptos"/>
-        </w:rPr>
-        <w:t xml:space="preserve"> </w:t>
-      </w:r>
-    </w:p>
-    <w:p>
-      <w:r>
-        <w:rPr>
-          <w:rFonts w:ascii="Aptos" w:eastAsia="Aptos" w:hAnsi="Aptos" w:cs="Aptos"/>
-        </w:rPr>
-        <w:t>If the Court finds good cause, the Court Clerk will seal your information, and it will not be shared with the Defendant or the public.</w:t>
+        <w:t xml:space="preserve">If the </w:t>
+      </w:r>
+      <w:r>
+        <w:rPr>
+          <w:rFonts w:ascii="Aptos" w:eastAsia="Aptos" w:hAnsi="Aptos" w:cs="Aptos"/>
+        </w:rPr>
+        <w:t xml:space="preserve">Tribal </w:t>
+      </w:r>
+      <w:r>
+        <w:rPr>
+          <w:rFonts w:ascii="Aptos" w:eastAsia="Aptos" w:hAnsi="Aptos" w:cs="Aptos"/>
+        </w:rPr>
+        <w:t>Court finds good cause, the</w:t>
+      </w:r>
+      <w:r>
+        <w:rPr>
+          <w:rFonts w:ascii="Aptos" w:eastAsia="Aptos" w:hAnsi="Aptos" w:cs="Aptos"/>
+        </w:rPr>
+        <w:t xml:space="preserve"> Tribal</w:t>
+      </w:r>
+      <w:r>
+        <w:rPr>
+          <w:rFonts w:ascii="Aptos" w:eastAsia="Aptos" w:hAnsi="Aptos" w:cs="Aptos"/>
+        </w:rPr>
+        <w:t xml:space="preserve"> Court Clerk will seal your information, and it will not be shared with the Defendant or the public.</w:t>
       </w:r>
     </w:p>
     <w:p>
@@ -2276,6 +2288,30 @@
         </w:rPr>
         <w:t xml:space="preserve"> }} I am a member of the Mashpee Wampanoag Tribe.</w:t>
       </w:r>
+      <w:r>
+        <w:rPr>
+          <w:rFonts w:ascii="Aptos" w:eastAsia="Aptos" w:hAnsi="Aptos" w:cs="Aptos"/>
+          <w:sz w:val="22"/>
+          <w:szCs w:val="22"/>
+        </w:rPr>
+        <w:t xml:space="preserve">  Tribal </w:t>
+      </w:r>
+      <w:r>
+        <w:rPr>
+          <w:rFonts w:ascii="Aptos" w:eastAsia="Aptos" w:hAnsi="Aptos" w:cs="Aptos"/>
+          <w:sz w:val="22"/>
+          <w:szCs w:val="22"/>
+        </w:rPr>
+        <w:t>ID</w:t>
+      </w:r>
+      <w:r>
+        <w:rPr>
+          <w:rFonts w:ascii="Aptos" w:eastAsia="Aptos" w:hAnsi="Aptos" w:cs="Aptos"/>
+          <w:sz w:val="22"/>
+          <w:szCs w:val="22"/>
+        </w:rPr>
+        <w:t>: {{ tribal_number }}</w:t>
+      </w:r>
     </w:p>
     <w:p>
       <w:pPr>
@@ -2330,6 +2366,14 @@
         </w:rPr>
         <w:t xml:space="preserve"> }} Defendant is a member of the Mashpee Wampanoag Tribe.</w:t>
       </w:r>
+      <w:r>
+        <w:rPr>
+          <w:rFonts w:ascii="Aptos" w:eastAsia="Aptos" w:hAnsi="Aptos" w:cs="Aptos"/>
+          <w:sz w:val="22"/>
+          <w:szCs w:val="22"/>
+        </w:rPr>
+        <w:t xml:space="preserve">  Tribal ID: {{ defendant_tribal_number }}</w:t>
+      </w:r>
     </w:p>
     <w:p>
       <w:pPr>
@@ -2400,6 +2444,30 @@
         </w:rPr>
         <w:t xml:space="preserve"> }} I am a member of a Federally recognized Indian Tribe: {{  tribe_name  }}.</w:t>
       </w:r>
+      <w:r>
+        <w:rPr>
+          <w:rFonts w:ascii="Aptos" w:eastAsia="Aptos" w:hAnsi="Aptos" w:cs="Aptos"/>
+          <w:sz w:val="22"/>
+          <w:szCs w:val="22"/>
+        </w:rPr>
+        <w:t xml:space="preserve">  Tribal </w:t>
+      </w:r>
+      <w:r>
+        <w:rPr>
+          <w:rFonts w:ascii="Aptos" w:eastAsia="Aptos" w:hAnsi="Aptos" w:cs="Aptos"/>
+          <w:sz w:val="22"/>
+          <w:szCs w:val="22"/>
+        </w:rPr>
+        <w:t>ID</w:t>
+      </w:r>
+      <w:r>
+        <w:rPr>
+          <w:rFonts w:ascii="Aptos" w:eastAsia="Aptos" w:hAnsi="Aptos" w:cs="Aptos"/>
+          <w:sz w:val="22"/>
+          <w:szCs w:val="22"/>
+        </w:rPr>
+        <w:t>: {{ other_tribal_number }}</w:t>
+      </w:r>
     </w:p>
     <w:p>
       <w:pPr>
@@ -2457,212 +2525,148 @@
     </w:p>
     <w:p>
       <w:pPr>
-        <w:rPr>
-          <w:rFonts w:ascii="Aptos" w:eastAsia="Aptos" w:hAnsi="Aptos" w:cs="Aptos"/>
-        </w:rPr>
-      </w:pPr>
-    </w:p>
-    <w:p/>
-    <w:p>
-      <w:pPr>
-        <w:spacing w:after="160"/>
-      </w:pPr>
-      <w:r>
-        <w:rPr>
-          <w:rFonts w:ascii="Aptos" w:eastAsia="Aptos" w:hAnsi="Aptos" w:cs="Aptos"/>
-          <w:sz w:val="22"/>
-          <w:szCs w:val="22"/>
-        </w:rPr>
-        <w:t>Identification of minors or vulnerable adults</w:t>
+        <w:pStyle w:val="NoSpacing"/>
+        <w:numPr>
+          <w:ilvl w:val="0"/>
+          <w:numId w:val="29"/>
+        </w:numPr>
+        <w:rPr>
+          <w:sz w:val="22"/>
+          <w:szCs w:val="22"/>
+        </w:rPr>
+      </w:pPr>
+      <w:r>
+        <w:rPr>
+          <w:sz w:val="22"/>
+          <w:szCs w:val="22"/>
+        </w:rPr>
+        <w:t>Other court cases or other restraining, protection or no-contact orders involving P</w:t>
+      </w:r>
+      <w:r>
+        <w:rPr>
+          <w:sz w:val="22"/>
+          <w:szCs w:val="22"/>
+        </w:rPr>
+        <w:t>laintiff</w:t>
+      </w:r>
+      <w:r>
+        <w:rPr>
+          <w:sz w:val="22"/>
+          <w:szCs w:val="22"/>
+        </w:rPr>
+        <w:t xml:space="preserve"> or </w:t>
+      </w:r>
+      <w:r>
+        <w:rPr>
+          <w:sz w:val="22"/>
+          <w:szCs w:val="22"/>
+        </w:rPr>
+        <w:t>Defendant. Attach additional pages, if necessary</w:t>
+      </w:r>
+      <w:r>
+        <w:rPr>
+          <w:sz w:val="22"/>
+          <w:szCs w:val="22"/>
+        </w:rPr>
+        <w:t>:</w:t>
       </w:r>
     </w:p>
     <w:p>
-      <w:r>
-        <w:rPr>
-          <w:rFonts w:ascii="Aptos" w:eastAsia="Aptos" w:hAnsi="Aptos" w:cs="Aptos"/>
-          <w:sz w:val="22"/>
-          <w:szCs w:val="22"/>
-        </w:rPr>
-        <w:t xml:space="preserve">(if applicable, use next page if needed): {{ </w:t>
-      </w:r>
-      <w:r>
-        <w:rPr>
-          <w:rFonts w:ascii="Aptos" w:eastAsia="Aptos" w:hAnsi="Aptos" w:cs="Aptos"/>
-          <w:sz w:val="22"/>
-          <w:szCs w:val="22"/>
-        </w:rPr>
-        <w:t>output_checkbox(</w:t>
-      </w:r>
-      <w:r>
-        <w:rPr>
-          <w:rFonts w:ascii="Aptos" w:eastAsia="Aptos" w:hAnsi="Aptos" w:cs="Aptos"/>
-          <w:sz w:val="22"/>
-          <w:szCs w:val="22"/>
-        </w:rPr>
-        <w:t>is_involves_vulnerable</w:t>
-      </w:r>
-      <w:r>
-        <w:rPr>
-          <w:rFonts w:ascii="Aptos" w:eastAsia="Aptos" w:hAnsi="Aptos" w:cs="Aptos"/>
-          <w:sz w:val="22"/>
-          <w:szCs w:val="22"/>
-        </w:rPr>
-        <w:t>)</w:t>
-      </w:r>
-      <w:r>
-        <w:rPr>
-          <w:rFonts w:ascii="Aptos" w:eastAsia="Aptos" w:hAnsi="Aptos" w:cs="Aptos"/>
-          <w:sz w:val="22"/>
-          <w:szCs w:val="22"/>
-        </w:rPr>
-        <w:t xml:space="preserve"> }}</w:t>
-      </w:r>
-    </w:p>
-    <w:p>
-      <w:r>
-        <w:rPr>
-          <w:rFonts w:ascii="Aptos" w:eastAsia="Aptos" w:hAnsi="Aptos" w:cs="Aptos"/>
-          <w:sz w:val="22"/>
-          <w:szCs w:val="22"/>
-        </w:rPr>
-        <w:t xml:space="preserve"> </w:t>
-      </w:r>
+      <w:pPr>
+        <w:pStyle w:val="NoSpacing"/>
+        <w:rPr>
+          <w:sz w:val="22"/>
+          <w:szCs w:val="22"/>
+        </w:rPr>
+      </w:pPr>
     </w:p>
     <w:tbl>
       <w:tblPr>
         <w:tblStyle w:val="TableGrid"/>
-        <w:tblW w:w="10800" w:type="dxa"/>
-        <w:tblInd w:w="-905" w:type="dxa"/>
-        <w:tblLayout w:type="fixed"/>
+        <w:tblW w:w="0" w:type="auto"/>
         <w:tblLook w:val="06A0" w:firstRow="1" w:lastRow="0" w:firstColumn="1" w:lastColumn="0" w:noHBand="1" w:noVBand="1"/>
       </w:tblPr>
       <w:tblGrid>
-        <w:gridCol w:w="4230"/>
-        <w:gridCol w:w="1800"/>
-        <w:gridCol w:w="2970"/>
-        <w:gridCol w:w="1800"/>
+        <w:gridCol w:w="3003"/>
+        <w:gridCol w:w="3003"/>
+        <w:gridCol w:w="3004"/>
       </w:tblGrid>
       <w:tr>
         <w:trPr>
-          <w:trHeight w:val="302"/>
+          <w:trHeight w:val="300"/>
         </w:trPr>
         <w:tc>
           <w:tcPr>
-            <w:tcW w:w="4230" w:type="dxa"/>
-            <w:tcBorders>
-              <w:top w:val="nil"/>
-              <w:left w:val="nil"/>
-              <w:right w:val="nil"/>
-            </w:tcBorders>
+            <w:tcW w:w="3005" w:type="dxa"/>
           </w:tcPr>
           <w:p>
             <w:pPr>
-              <w:jc w:val="center"/>
-              <w:rPr>
-                <w:rFonts w:ascii="Aptos" w:eastAsia="Aptos" w:hAnsi="Aptos" w:cs="Aptos"/>
-                <w:sz w:val="22"/>
-                <w:szCs w:val="22"/>
-              </w:rPr>
-            </w:pPr>
-            <w:r>
-              <w:rPr>
-                <w:rFonts w:ascii="Aptos" w:eastAsia="Aptos" w:hAnsi="Aptos" w:cs="Aptos"/>
-                <w:sz w:val="22"/>
-                <w:szCs w:val="22"/>
-              </w:rPr>
-              <w:t xml:space="preserve">Full </w:t>
-            </w:r>
-            <w:r>
-              <w:rPr>
-                <w:rFonts w:ascii="Aptos" w:eastAsia="Aptos" w:hAnsi="Aptos" w:cs="Aptos"/>
-                <w:sz w:val="22"/>
-                <w:szCs w:val="22"/>
-              </w:rPr>
-              <w:t>Name</w:t>
+              <w:pStyle w:val="NoSpacing"/>
+              <w:rPr>
+                <w:b/>
+                <w:bCs/>
+                <w:sz w:val="22"/>
+                <w:szCs w:val="22"/>
+              </w:rPr>
+            </w:pPr>
+            <w:r>
+              <w:rPr>
+                <w:b/>
+                <w:bCs/>
+                <w:sz w:val="22"/>
+                <w:szCs w:val="22"/>
+              </w:rPr>
+              <w:t>CASE NAME</w:t>
             </w:r>
           </w:p>
         </w:tc>
         <w:tc>
           <w:tcPr>
-            <w:tcW w:w="1800" w:type="dxa"/>
-            <w:tcBorders>
-              <w:top w:val="nil"/>
-              <w:left w:val="nil"/>
-              <w:right w:val="nil"/>
-            </w:tcBorders>
+            <w:tcW w:w="3005" w:type="dxa"/>
           </w:tcPr>
           <w:p>
             <w:pPr>
-              <w:jc w:val="center"/>
-              <w:rPr>
-                <w:rFonts w:ascii="Aptos" w:eastAsia="Aptos" w:hAnsi="Aptos" w:cs="Aptos"/>
-                <w:sz w:val="22"/>
-                <w:szCs w:val="22"/>
-              </w:rPr>
-            </w:pPr>
-            <w:r>
-              <w:rPr>
-                <w:rFonts w:ascii="Aptos" w:eastAsia="Aptos" w:hAnsi="Aptos" w:cs="Aptos"/>
-                <w:sz w:val="22"/>
-                <w:szCs w:val="22"/>
-              </w:rPr>
-              <w:t>Age</w:t>
+              <w:pStyle w:val="NoSpacing"/>
+              <w:rPr>
+                <w:b/>
+                <w:bCs/>
+                <w:sz w:val="22"/>
+                <w:szCs w:val="22"/>
+              </w:rPr>
+            </w:pPr>
+            <w:r>
+              <w:rPr>
+                <w:b/>
+                <w:bCs/>
+                <w:sz w:val="22"/>
+                <w:szCs w:val="22"/>
+              </w:rPr>
+              <w:t>CASE NUMBER</w:t>
             </w:r>
           </w:p>
         </w:tc>
         <w:tc>
           <w:tcPr>
-            <w:tcW w:w="2970" w:type="dxa"/>
-            <w:tcBorders>
-              <w:top w:val="nil"/>
-              <w:left w:val="nil"/>
-              <w:right w:val="nil"/>
-            </w:tcBorders>
+            <w:tcW w:w="3005" w:type="dxa"/>
           </w:tcPr>
           <w:p>
             <w:pPr>
-              <w:jc w:val="center"/>
-              <w:rPr>
-                <w:rFonts w:ascii="Aptos" w:eastAsia="Aptos" w:hAnsi="Aptos" w:cs="Aptos"/>
-                <w:sz w:val="22"/>
-                <w:szCs w:val="22"/>
-              </w:rPr>
-            </w:pPr>
-            <w:r>
-              <w:rPr>
-                <w:rFonts w:ascii="Aptos" w:eastAsia="Aptos" w:hAnsi="Aptos" w:cs="Aptos"/>
-                <w:sz w:val="22"/>
-                <w:szCs w:val="22"/>
-              </w:rPr>
-              <w:t>Race or Tribal Affiliation</w:t>
-            </w:r>
-          </w:p>
-        </w:tc>
-        <w:tc>
-          <w:tcPr>
-            <w:tcW w:w="1800" w:type="dxa"/>
-            <w:tcBorders>
-              <w:top w:val="nil"/>
-              <w:left w:val="nil"/>
-              <w:right w:val="nil"/>
-            </w:tcBorders>
-          </w:tcPr>
-          <w:p>
-            <w:pPr>
-              <w:jc w:val="center"/>
-              <w:rPr>
-                <w:rFonts w:ascii="Aptos" w:eastAsia="Aptos" w:hAnsi="Aptos" w:cs="Aptos"/>
-                <w:sz w:val="22"/>
-                <w:szCs w:val="22"/>
-              </w:rPr>
-            </w:pPr>
-            <w:r>
-              <w:rPr>
-                <w:rFonts w:ascii="Aptos" w:eastAsia="Aptos" w:hAnsi="Aptos" w:cs="Aptos"/>
-                <w:sz w:val="22"/>
-                <w:szCs w:val="22"/>
-              </w:rPr>
-              <w:t>Sex</w:t>
+              <w:pStyle w:val="NoSpacing"/>
+              <w:rPr>
+                <w:b/>
+                <w:bCs/>
+                <w:sz w:val="22"/>
+                <w:szCs w:val="22"/>
+              </w:rPr>
+            </w:pPr>
+            <w:r>
+              <w:rPr>
+                <w:b/>
+                <w:bCs/>
+                <w:sz w:val="22"/>
+                <w:szCs w:val="22"/>
+              </w:rPr>
+              <w:t>COURT/ COUNTY</w:t>
             </w:r>
           </w:p>
         </w:tc>
@@ -2673,56 +2677,53 @@
         </w:trPr>
         <w:tc>
           <w:tcPr>
-            <w:tcW w:w="4230" w:type="dxa"/>
-            <w:tcBorders>
-              <w:bottom w:val="single" w:sz="2" w:space="0" w:color="000000" w:themeColor="text1"/>
-            </w:tcBorders>
+            <w:tcW w:w="3005" w:type="dxa"/>
           </w:tcPr>
           <w:p>
             <w:pPr>
-              <w:rPr>
-                <w:rFonts w:ascii="Aptos" w:eastAsia="Aptos" w:hAnsi="Aptos" w:cs="Aptos"/>
-                <w:sz w:val="22"/>
-                <w:szCs w:val="22"/>
-              </w:rPr>
-            </w:pPr>
-            <w:r>
-              <w:rPr>
-                <w:rFonts w:ascii="Aptos" w:eastAsia="Aptos" w:hAnsi="Aptos" w:cs="Aptos"/>
-                <w:sz w:val="22"/>
-                <w:szCs w:val="22"/>
-              </w:rPr>
-              <w:t xml:space="preserve">{%tr for </w:t>
-            </w:r>
-            <w:r>
-              <w:rPr>
-                <w:rFonts w:ascii="Aptos" w:eastAsia="Aptos" w:hAnsi="Aptos" w:cs="Aptos"/>
-                <w:sz w:val="22"/>
-                <w:szCs w:val="22"/>
-              </w:rPr>
-              <w:t>person</w:t>
-            </w:r>
-            <w:r>
-              <w:rPr>
-                <w:rFonts w:ascii="Aptos" w:eastAsia="Aptos" w:hAnsi="Aptos" w:cs="Aptos"/>
-                <w:sz w:val="22"/>
-                <w:szCs w:val="22"/>
-              </w:rPr>
-              <w:t xml:space="preserve"> in vul_person %}</w:t>
+              <w:spacing w:line="259" w:lineRule="auto"/>
+              <w:rPr>
+                <w:rFonts w:ascii="Aptos" w:eastAsia="Aptos" w:hAnsi="Aptos" w:cs="Aptos"/>
+                <w:sz w:val="22"/>
+                <w:szCs w:val="22"/>
+              </w:rPr>
+            </w:pPr>
+            <w:r>
+              <w:rPr>
+                <w:rFonts w:ascii="Aptos" w:eastAsia="Aptos" w:hAnsi="Aptos" w:cs="Aptos"/>
+                <w:color w:val="000000" w:themeColor="text1"/>
+                <w:sz w:val="22"/>
+                <w:szCs w:val="22"/>
+              </w:rPr>
+              <w:t xml:space="preserve">{%tr for case in </w:t>
+            </w:r>
+            <w:r>
+              <w:rPr>
+                <w:rFonts w:ascii="Aptos" w:eastAsia="Aptos" w:hAnsi="Aptos" w:cs="Aptos"/>
+                <w:sz w:val="22"/>
+                <w:szCs w:val="22"/>
+              </w:rPr>
+              <w:t>cases</w:t>
+            </w:r>
+            <w:r>
+              <w:rPr>
+                <w:rFonts w:ascii="Aptos" w:eastAsia="Aptos" w:hAnsi="Aptos" w:cs="Aptos"/>
+                <w:color w:val="000000" w:themeColor="text1"/>
+                <w:sz w:val="22"/>
+                <w:szCs w:val="22"/>
+              </w:rPr>
+              <w:t xml:space="preserve"> %}</w:t>
             </w:r>
           </w:p>
         </w:tc>
         <w:tc>
           <w:tcPr>
-            <w:tcW w:w="1800" w:type="dxa"/>
-            <w:tcBorders>
-              <w:bottom w:val="single" w:sz="2" w:space="0" w:color="000000" w:themeColor="text1"/>
-            </w:tcBorders>
+            <w:tcW w:w="3005" w:type="dxa"/>
           </w:tcPr>
           <w:p>
             <w:pPr>
-              <w:rPr>
-                <w:rFonts w:ascii="Aptos" w:eastAsia="Aptos" w:hAnsi="Aptos" w:cs="Aptos"/>
+              <w:pStyle w:val="NoSpacing"/>
+              <w:rPr>
                 <w:sz w:val="22"/>
                 <w:szCs w:val="22"/>
               </w:rPr>
@@ -2731,433 +2732,12 @@
         </w:tc>
         <w:tc>
           <w:tcPr>
-            <w:tcW w:w="2970" w:type="dxa"/>
-            <w:tcBorders>
-              <w:bottom w:val="single" w:sz="2" w:space="0" w:color="000000" w:themeColor="text1"/>
-            </w:tcBorders>
+            <w:tcW w:w="3005" w:type="dxa"/>
           </w:tcPr>
           <w:p>
             <w:pPr>
-              <w:rPr>
-                <w:rFonts w:ascii="Aptos" w:eastAsia="Aptos" w:hAnsi="Aptos" w:cs="Aptos"/>
-                <w:sz w:val="22"/>
-                <w:szCs w:val="22"/>
-              </w:rPr>
-            </w:pPr>
-          </w:p>
-        </w:tc>
-        <w:tc>
-          <w:tcPr>
-            <w:tcW w:w="1800" w:type="dxa"/>
-            <w:tcBorders>
-              <w:bottom w:val="single" w:sz="2" w:space="0" w:color="000000" w:themeColor="text1"/>
-            </w:tcBorders>
-          </w:tcPr>
-          <w:p>
-            <w:pPr>
-              <w:rPr>
-                <w:rFonts w:ascii="Aptos" w:eastAsia="Aptos" w:hAnsi="Aptos" w:cs="Aptos"/>
-                <w:sz w:val="22"/>
-                <w:szCs w:val="22"/>
-              </w:rPr>
-            </w:pPr>
-          </w:p>
-        </w:tc>
-      </w:tr>
-      <w:tr>
-        <w:trPr>
-          <w:trHeight w:val="302"/>
-        </w:trPr>
-        <w:tc>
-          <w:tcPr>
-            <w:tcW w:w="4230" w:type="dxa"/>
-          </w:tcPr>
-          <w:p>
-            <w:pPr>
-              <w:rPr>
-                <w:rFonts w:ascii="Aptos" w:eastAsia="Aptos" w:hAnsi="Aptos" w:cs="Aptos"/>
-                <w:sz w:val="22"/>
-                <w:szCs w:val="22"/>
-              </w:rPr>
-            </w:pPr>
-            <w:r>
-              <w:rPr>
-                <w:rFonts w:ascii="Aptos" w:eastAsia="Aptos" w:hAnsi="Aptos" w:cs="Aptos"/>
-                <w:sz w:val="22"/>
-                <w:szCs w:val="22"/>
-              </w:rPr>
-              <w:t>{{ person.name</w:t>
-            </w:r>
-            <w:r>
-              <w:rPr>
-                <w:rFonts w:ascii="Aptos" w:eastAsia="Aptos" w:hAnsi="Aptos" w:cs="Aptos"/>
-                <w:sz w:val="22"/>
-                <w:szCs w:val="22"/>
-              </w:rPr>
-              <w:t>.full()</w:t>
-            </w:r>
-            <w:r>
-              <w:rPr>
-                <w:rFonts w:ascii="Aptos" w:eastAsia="Aptos" w:hAnsi="Aptos" w:cs="Aptos"/>
-                <w:sz w:val="22"/>
-                <w:szCs w:val="22"/>
-              </w:rPr>
-              <w:t xml:space="preserve"> }}</w:t>
-            </w:r>
-          </w:p>
-        </w:tc>
-        <w:tc>
-          <w:tcPr>
-            <w:tcW w:w="1800" w:type="dxa"/>
-          </w:tcPr>
-          <w:p>
-            <w:pPr>
-              <w:rPr>
-                <w:rFonts w:ascii="Aptos" w:eastAsia="Aptos" w:hAnsi="Aptos" w:cs="Aptos"/>
-                <w:sz w:val="22"/>
-                <w:szCs w:val="22"/>
-              </w:rPr>
-            </w:pPr>
-            <w:r>
-              <w:rPr>
-                <w:rFonts w:ascii="Aptos" w:eastAsia="Aptos" w:hAnsi="Aptos" w:cs="Aptos"/>
-                <w:sz w:val="22"/>
-                <w:szCs w:val="22"/>
-              </w:rPr>
-              <w:t>{{ person.</w:t>
-            </w:r>
-            <w:r>
-              <w:rPr>
-                <w:rFonts w:ascii="Aptos" w:eastAsia="Aptos" w:hAnsi="Aptos" w:cs="Aptos"/>
-                <w:sz w:val="22"/>
-                <w:szCs w:val="22"/>
-              </w:rPr>
-              <w:t xml:space="preserve"> age_in_years()</w:t>
-            </w:r>
-            <w:r>
-              <w:rPr>
-                <w:rFonts w:ascii="Aptos" w:eastAsia="Aptos" w:hAnsi="Aptos" w:cs="Aptos"/>
-                <w:sz w:val="22"/>
-                <w:szCs w:val="22"/>
-              </w:rPr>
-              <w:t xml:space="preserve"> }}</w:t>
-            </w:r>
-          </w:p>
-        </w:tc>
-        <w:tc>
-          <w:tcPr>
-            <w:tcW w:w="2970" w:type="dxa"/>
-          </w:tcPr>
-          <w:p>
-            <w:pPr>
-              <w:rPr>
-                <w:rFonts w:ascii="Aptos" w:eastAsia="Aptos" w:hAnsi="Aptos" w:cs="Aptos"/>
-                <w:sz w:val="22"/>
-                <w:szCs w:val="22"/>
-              </w:rPr>
-            </w:pPr>
-            <w:r>
-              <w:rPr>
-                <w:rFonts w:ascii="Aptos" w:eastAsia="Aptos" w:hAnsi="Aptos" w:cs="Aptos"/>
-                <w:sz w:val="22"/>
-                <w:szCs w:val="22"/>
-              </w:rPr>
-              <w:t>{{ person.ethnic }}</w:t>
-            </w:r>
-          </w:p>
-        </w:tc>
-        <w:tc>
-          <w:tcPr>
-            <w:tcW w:w="1800" w:type="dxa"/>
-            <w:tcBorders>
-              <w:bottom w:val="single" w:sz="2" w:space="0" w:color="000000" w:themeColor="text1"/>
-            </w:tcBorders>
-          </w:tcPr>
-          <w:p>
-            <w:pPr>
-              <w:rPr>
-                <w:rFonts w:ascii="Aptos" w:eastAsia="Aptos" w:hAnsi="Aptos" w:cs="Aptos"/>
-                <w:sz w:val="22"/>
-                <w:szCs w:val="22"/>
-              </w:rPr>
-            </w:pPr>
-            <w:r>
-              <w:rPr>
-                <w:rFonts w:ascii="Aptos" w:eastAsia="Aptos" w:hAnsi="Aptos" w:cs="Aptos"/>
-                <w:sz w:val="22"/>
-                <w:szCs w:val="22"/>
-              </w:rPr>
-              <w:t>{{ person</w:t>
-            </w:r>
-            <w:r>
-              <w:rPr>
-                <w:rFonts w:ascii="Aptos" w:eastAsia="Aptos" w:hAnsi="Aptos" w:cs="Aptos"/>
-                <w:sz w:val="22"/>
-                <w:szCs w:val="22"/>
-              </w:rPr>
-              <w:t>.gender</w:t>
-            </w:r>
-            <w:r>
-              <w:rPr>
-                <w:rFonts w:ascii="Aptos" w:eastAsia="Aptos" w:hAnsi="Aptos" w:cs="Aptos"/>
-                <w:sz w:val="22"/>
-                <w:szCs w:val="22"/>
-              </w:rPr>
-              <w:t xml:space="preserve"> }}</w:t>
-            </w:r>
-          </w:p>
-        </w:tc>
-      </w:tr>
-      <w:tr>
-        <w:trPr>
-          <w:trHeight w:val="302"/>
-        </w:trPr>
-        <w:tc>
-          <w:tcPr>
-            <w:tcW w:w="4230" w:type="dxa"/>
-          </w:tcPr>
-          <w:p>
-            <w:pPr>
-              <w:rPr>
-                <w:rFonts w:ascii="Aptos" w:eastAsia="Aptos" w:hAnsi="Aptos" w:cs="Aptos"/>
-                <w:sz w:val="22"/>
-                <w:szCs w:val="22"/>
-              </w:rPr>
-            </w:pPr>
-            <w:r>
-              <w:rPr>
-                <w:rFonts w:ascii="Aptos" w:eastAsia="Aptos" w:hAnsi="Aptos" w:cs="Aptos"/>
-                <w:sz w:val="22"/>
-                <w:szCs w:val="22"/>
-              </w:rPr>
-              <w:t>{%tr endfor %}</w:t>
-            </w:r>
-          </w:p>
-        </w:tc>
-        <w:tc>
-          <w:tcPr>
-            <w:tcW w:w="1800" w:type="dxa"/>
-          </w:tcPr>
-          <w:p>
-            <w:pPr>
-              <w:rPr>
-                <w:rFonts w:ascii="Aptos" w:eastAsia="Aptos" w:hAnsi="Aptos" w:cs="Aptos"/>
-                <w:sz w:val="22"/>
-                <w:szCs w:val="22"/>
-              </w:rPr>
-            </w:pPr>
-          </w:p>
-        </w:tc>
-        <w:tc>
-          <w:tcPr>
-            <w:tcW w:w="2970" w:type="dxa"/>
-          </w:tcPr>
-          <w:p>
-            <w:pPr>
-              <w:rPr>
-                <w:rFonts w:ascii="Aptos" w:eastAsia="Aptos" w:hAnsi="Aptos" w:cs="Aptos"/>
-                <w:sz w:val="22"/>
-                <w:szCs w:val="22"/>
-              </w:rPr>
-            </w:pPr>
-          </w:p>
-        </w:tc>
-        <w:tc>
-          <w:tcPr>
-            <w:tcW w:w="1800" w:type="dxa"/>
-            <w:tcBorders>
-              <w:top w:val="single" w:sz="2" w:space="0" w:color="000000" w:themeColor="text1"/>
-            </w:tcBorders>
-          </w:tcPr>
-          <w:p>
-            <w:pPr>
-              <w:rPr>
-                <w:rFonts w:ascii="Aptos" w:eastAsia="Aptos" w:hAnsi="Aptos" w:cs="Aptos"/>
-                <w:sz w:val="22"/>
-                <w:szCs w:val="22"/>
-              </w:rPr>
-            </w:pPr>
-          </w:p>
-        </w:tc>
-      </w:tr>
-    </w:tbl>
-    <w:p>
-      <w:r>
-        <w:rPr>
-          <w:rFonts w:ascii="Aptos" w:eastAsia="Aptos" w:hAnsi="Aptos" w:cs="Aptos"/>
-        </w:rPr>
-        <w:lastRenderedPageBreak/>
-        <w:t xml:space="preserve"> </w:t>
-      </w:r>
-    </w:p>
-    <w:p>
-      <w:pPr>
-        <w:pStyle w:val="NoSpacing"/>
-        <w:numPr>
-          <w:ilvl w:val="0"/>
-          <w:numId w:val="29"/>
-        </w:numPr>
-        <w:rPr>
-          <w:sz w:val="22"/>
-          <w:szCs w:val="22"/>
-        </w:rPr>
-      </w:pPr>
-      <w:r>
-        <w:rPr>
-          <w:sz w:val="22"/>
-          <w:szCs w:val="22"/>
-        </w:rPr>
-        <w:t>Other court cases or other restraining, protection or no-contact orders involving P</w:t>
-      </w:r>
-      <w:r>
-        <w:rPr>
-          <w:sz w:val="22"/>
-          <w:szCs w:val="22"/>
-        </w:rPr>
-        <w:t>laintiff</w:t>
-      </w:r>
-      <w:r>
-        <w:rPr>
-          <w:sz w:val="22"/>
-          <w:szCs w:val="22"/>
-        </w:rPr>
-        <w:t>, Defendant,</w:t>
-      </w:r>
-      <w:r>
-        <w:rPr>
-          <w:sz w:val="22"/>
-          <w:szCs w:val="22"/>
-        </w:rPr>
-        <w:t xml:space="preserve"> </w:t>
-      </w:r>
-      <w:r>
-        <w:rPr>
-          <w:sz w:val="22"/>
-          <w:szCs w:val="22"/>
-        </w:rPr>
-        <w:t>minor child(ren) or vulnerable adults). Attach additional pages, if necessary</w:t>
-      </w:r>
-      <w:r>
-        <w:rPr>
-          <w:sz w:val="22"/>
-          <w:szCs w:val="22"/>
-        </w:rPr>
-        <w:t>:</w:t>
-      </w:r>
-    </w:p>
-    <w:tbl>
-      <w:tblPr>
-        <w:tblStyle w:val="TableGrid"/>
-        <w:tblW w:w="10800" w:type="dxa"/>
-        <w:tblInd w:w="-905" w:type="dxa"/>
-        <w:tblLayout w:type="fixed"/>
-        <w:tblLook w:val="06A0" w:firstRow="1" w:lastRow="0" w:firstColumn="1" w:lastColumn="0" w:noHBand="1" w:noVBand="1"/>
-      </w:tblPr>
-      <w:tblGrid>
-        <w:gridCol w:w="1980"/>
-        <w:gridCol w:w="2880"/>
-        <w:gridCol w:w="2807"/>
-        <w:gridCol w:w="3133"/>
-      </w:tblGrid>
-      <w:tr>
-        <w:trPr>
-          <w:trHeight w:val="300"/>
-        </w:trPr>
-        <w:tc>
-          <w:tcPr>
-            <w:tcW w:w="1980" w:type="dxa"/>
-          </w:tcPr>
-          <w:p>
-            <w:pPr>
-              <w:pStyle w:val="NoSpacing"/>
-              <w:rPr>
-                <w:b/>
-                <w:bCs/>
-                <w:sz w:val="22"/>
-                <w:szCs w:val="22"/>
-              </w:rPr>
-            </w:pPr>
-            <w:r>
-              <w:rPr>
-                <w:b/>
-                <w:bCs/>
-                <w:sz w:val="22"/>
-                <w:szCs w:val="22"/>
-              </w:rPr>
-              <w:t>CASE NAME</w:t>
-            </w:r>
-          </w:p>
-        </w:tc>
-        <w:tc>
-          <w:tcPr>
-            <w:tcW w:w="2880" w:type="dxa"/>
-          </w:tcPr>
-          <w:p>
-            <w:pPr>
-              <w:pStyle w:val="NoSpacing"/>
-              <w:rPr>
-                <w:sz w:val="22"/>
-                <w:szCs w:val="22"/>
-              </w:rPr>
-            </w:pPr>
-            <w:r>
-              <w:rPr>
-                <w:rFonts w:ascii="Aptos" w:eastAsia="Aptos" w:hAnsi="Aptos" w:cs="Aptos"/>
-                <w:sz w:val="22"/>
-                <w:szCs w:val="22"/>
-              </w:rPr>
-              <w:t>{{ case</w:t>
-            </w:r>
-            <w:r>
-              <w:rPr>
-                <w:rFonts w:ascii="Aptos" w:eastAsia="Aptos" w:hAnsi="Aptos" w:cs="Aptos"/>
-                <w:sz w:val="22"/>
-                <w:szCs w:val="22"/>
-              </w:rPr>
-              <w:t>s[0]</w:t>
-            </w:r>
-            <w:r>
-              <w:rPr>
-                <w:rFonts w:ascii="Aptos" w:eastAsia="Aptos" w:hAnsi="Aptos" w:cs="Aptos"/>
-                <w:sz w:val="22"/>
-                <w:szCs w:val="22"/>
-              </w:rPr>
-              <w:t>.</w:t>
-            </w:r>
-            <w:r>
-              <w:rPr>
-                <w:rFonts w:ascii="Aptos" w:eastAsia="Aptos" w:hAnsi="Aptos" w:cs="Aptos"/>
-                <w:sz w:val="22"/>
-                <w:szCs w:val="22"/>
-              </w:rPr>
-              <w:t>name }}</w:t>
-            </w:r>
-          </w:p>
-        </w:tc>
-        <w:tc>
-          <w:tcPr>
-            <w:tcW w:w="2807" w:type="dxa"/>
-          </w:tcPr>
-          <w:p>
-            <w:pPr>
-              <w:pStyle w:val="NoSpacing"/>
-              <w:rPr>
-                <w:rFonts w:ascii="Aptos" w:eastAsia="Aptos" w:hAnsi="Aptos" w:cs="Aptos"/>
-                <w:sz w:val="22"/>
-                <w:szCs w:val="22"/>
-              </w:rPr>
-            </w:pPr>
-          </w:p>
-        </w:tc>
-        <w:tc>
-          <w:tcPr>
-            <w:tcW w:w="3133" w:type="dxa"/>
-          </w:tcPr>
-          <w:p>
-            <w:pPr>
-              <w:pStyle w:val="NoSpacing"/>
-              <w:rPr>
-                <w:rFonts w:ascii="Aptos" w:eastAsia="Aptos" w:hAnsi="Aptos" w:cs="Aptos"/>
+              <w:pStyle w:val="NoSpacing"/>
+              <w:rPr>
                 <w:sz w:val="22"/>
                 <w:szCs w:val="22"/>
               </w:rPr>
@@ -3171,32 +2751,29 @@
         </w:trPr>
         <w:tc>
           <w:tcPr>
-            <w:tcW w:w="1980" w:type="dxa"/>
+            <w:tcW w:w="3005" w:type="dxa"/>
           </w:tcPr>
           <w:p>
             <w:pPr>
               <w:pStyle w:val="NoSpacing"/>
               <w:rPr>
-                <w:b/>
-                <w:bCs/>
-                <w:sz w:val="22"/>
-                <w:szCs w:val="22"/>
-              </w:rPr>
-            </w:pPr>
-            <w:r>
-              <w:rPr>
-                <w:b/>
-                <w:bCs/>
-                <w:sz w:val="22"/>
-                <w:szCs w:val="22"/>
-              </w:rPr>
-              <w:t>CASE NUMBER</w:t>
+                <w:sz w:val="22"/>
+                <w:szCs w:val="22"/>
+              </w:rPr>
+            </w:pPr>
+            <w:r>
+              <w:rPr>
+                <w:rFonts w:ascii="Aptos" w:eastAsia="Aptos" w:hAnsi="Aptos" w:cs="Aptos"/>
+                <w:sz w:val="22"/>
+                <w:szCs w:val="22"/>
+              </w:rPr>
+              <w:t>{{ case.name }}</w:t>
             </w:r>
           </w:p>
         </w:tc>
         <w:tc>
           <w:tcPr>
-            <w:tcW w:w="2880" w:type="dxa"/>
+            <w:tcW w:w="3005" w:type="dxa"/>
           </w:tcPr>
           <w:p>
             <w:pPr>
@@ -3212,62 +2789,44 @@
                 <w:sz w:val="22"/>
                 <w:szCs w:val="22"/>
               </w:rPr>
-              <w:t xml:space="preserve">{{ </w:t>
-            </w:r>
-            <w:r>
-              <w:rPr>
-                <w:rFonts w:ascii="Aptos" w:eastAsia="Aptos" w:hAnsi="Aptos" w:cs="Aptos"/>
-                <w:sz w:val="22"/>
-                <w:szCs w:val="22"/>
-              </w:rPr>
-              <w:t>cases[0]</w:t>
-            </w:r>
-            <w:r>
-              <w:rPr>
-                <w:rFonts w:ascii="Aptos" w:eastAsia="Aptos" w:hAnsi="Aptos" w:cs="Aptos"/>
-                <w:sz w:val="22"/>
-                <w:szCs w:val="22"/>
-              </w:rPr>
-              <w:t>.</w:t>
-            </w:r>
-            <w:r>
-              <w:rPr>
-                <w:rFonts w:ascii="Aptos" w:eastAsia="Aptos" w:hAnsi="Aptos" w:cs="Aptos"/>
-                <w:sz w:val="22"/>
-                <w:szCs w:val="22"/>
-              </w:rPr>
-              <w:t>number }}</w:t>
+              <w:t>{{ case.number }}</w:t>
             </w:r>
           </w:p>
         </w:tc>
         <w:tc>
           <w:tcPr>
-            <w:tcW w:w="2807" w:type="dxa"/>
+            <w:tcW w:w="3005" w:type="dxa"/>
           </w:tcPr>
           <w:p>
             <w:pPr>
               <w:pStyle w:val="NoSpacing"/>
               <w:rPr>
-                <w:rFonts w:ascii="Aptos" w:eastAsia="Aptos" w:hAnsi="Aptos" w:cs="Aptos"/>
-                <w:sz w:val="22"/>
-                <w:szCs w:val="22"/>
-              </w:rPr>
-            </w:pPr>
-          </w:p>
-        </w:tc>
-        <w:tc>
-          <w:tcPr>
-            <w:tcW w:w="3133" w:type="dxa"/>
-          </w:tcPr>
-          <w:p>
-            <w:pPr>
-              <w:pStyle w:val="NoSpacing"/>
-              <w:rPr>
-                <w:rFonts w:ascii="Aptos" w:eastAsia="Aptos" w:hAnsi="Aptos" w:cs="Aptos"/>
-                <w:sz w:val="22"/>
-                <w:szCs w:val="22"/>
-              </w:rPr>
-            </w:pPr>
+                <w:sz w:val="22"/>
+                <w:szCs w:val="22"/>
+              </w:rPr>
+            </w:pPr>
+            <w:r>
+              <w:rPr>
+                <w:sz w:val="22"/>
+                <w:szCs w:val="22"/>
+              </w:rPr>
+              <w:t>{{</w:t>
+            </w:r>
+            <w:r>
+              <w:rPr>
+                <w:rFonts w:ascii="Aptos" w:eastAsia="Aptos" w:hAnsi="Aptos" w:cs="Aptos"/>
+                <w:sz w:val="22"/>
+                <w:szCs w:val="22"/>
+              </w:rPr>
+              <w:t>case</w:t>
+            </w:r>
+            <w:r>
+              <w:rPr>
+                <w:sz w:val="22"/>
+                <w:szCs w:val="22"/>
+              </w:rPr>
+              <w:t>.court_or_county }}</w:t>
+            </w:r>
           </w:p>
         </w:tc>
       </w:tr>
@@ -3277,32 +2836,30 @@
         </w:trPr>
         <w:tc>
           <w:tcPr>
-            <w:tcW w:w="1980" w:type="dxa"/>
+            <w:tcW w:w="3005" w:type="dxa"/>
           </w:tcPr>
           <w:p>
             <w:pPr>
-              <w:pStyle w:val="NoSpacing"/>
-              <w:rPr>
-                <w:b/>
-                <w:bCs/>
-                <w:sz w:val="22"/>
-                <w:szCs w:val="22"/>
-              </w:rPr>
-            </w:pPr>
-            <w:r>
-              <w:rPr>
-                <w:b/>
-                <w:bCs/>
-                <w:sz w:val="22"/>
-                <w:szCs w:val="22"/>
-              </w:rPr>
-              <w:t>COURT/ COUNTY</w:t>
+              <w:rPr>
+                <w:rFonts w:ascii="Aptos" w:eastAsia="Aptos" w:hAnsi="Aptos" w:cs="Aptos"/>
+                <w:sz w:val="22"/>
+                <w:szCs w:val="22"/>
+              </w:rPr>
+            </w:pPr>
+            <w:r>
+              <w:rPr>
+                <w:rFonts w:ascii="Aptos" w:eastAsia="Aptos" w:hAnsi="Aptos" w:cs="Aptos"/>
+                <w:color w:val="000000" w:themeColor="text1"/>
+                <w:sz w:val="22"/>
+                <w:szCs w:val="22"/>
+              </w:rPr>
+              <w:t>{%tr endfor %}</w:t>
             </w:r>
           </w:p>
         </w:tc>
         <w:tc>
           <w:tcPr>
-            <w:tcW w:w="2880" w:type="dxa"/>
+            <w:tcW w:w="3005" w:type="dxa"/>
           </w:tcPr>
           <w:p>
             <w:pPr>
@@ -3312,68 +2869,11 @@
                 <w:szCs w:val="22"/>
               </w:rPr>
             </w:pPr>
-            <w:r>
-              <w:rPr>
-                <w:sz w:val="22"/>
-                <w:szCs w:val="22"/>
-              </w:rPr>
-              <w:t>{{</w:t>
-            </w:r>
-            <w:r>
-              <w:rPr>
-                <w:rFonts w:ascii="Aptos" w:eastAsia="Aptos" w:hAnsi="Aptos" w:cs="Aptos"/>
-                <w:sz w:val="22"/>
-                <w:szCs w:val="22"/>
-              </w:rPr>
-              <w:t>cases[0]</w:t>
-            </w:r>
-            <w:r>
-              <w:rPr>
-                <w:sz w:val="22"/>
-                <w:szCs w:val="22"/>
-              </w:rPr>
-              <w:t>.</w:t>
-            </w:r>
-            <w:r>
-              <w:rPr>
-                <w:sz w:val="22"/>
-                <w:szCs w:val="22"/>
-              </w:rPr>
-              <w:t>court</w:t>
-            </w:r>
-            <w:r>
-              <w:rPr>
-                <w:sz w:val="22"/>
-                <w:szCs w:val="22"/>
-              </w:rPr>
-              <w:t>_or_</w:t>
-            </w:r>
-            <w:r>
-              <w:rPr>
-                <w:sz w:val="22"/>
-                <w:szCs w:val="22"/>
-              </w:rPr>
-              <w:t>county }}</w:t>
-            </w:r>
           </w:p>
         </w:tc>
         <w:tc>
           <w:tcPr>
-            <w:tcW w:w="2807" w:type="dxa"/>
-          </w:tcPr>
-          <w:p>
-            <w:pPr>
-              <w:pStyle w:val="NoSpacing"/>
-              <w:rPr>
-                <w:sz w:val="22"/>
-                <w:szCs w:val="22"/>
-              </w:rPr>
-            </w:pPr>
-          </w:p>
-        </w:tc>
-        <w:tc>
-          <w:tcPr>
-            <w:tcW w:w="3133" w:type="dxa"/>
+            <w:tcW w:w="3005" w:type="dxa"/>
           </w:tcPr>
           <w:p>
             <w:pPr>
@@ -3387,9 +2887,15 @@
         </w:tc>
       </w:tr>
     </w:tbl>
+    <w:p/>
     <w:p>
       <w:pPr>
         <w:pStyle w:val="NoSpacing"/>
+        <w:spacing w:line="259" w:lineRule="auto"/>
+        <w:rPr>
+          <w:sz w:val="22"/>
+          <w:szCs w:val="22"/>
+        </w:rPr>
       </w:pPr>
     </w:p>
     <w:tbl>
@@ -3418,6 +2924,7 @@
               <w:pStyle w:val="NoSpacing"/>
             </w:pPr>
             <w:r>
+              <w:lastRenderedPageBreak/>
               <w:t>REQUEST FOR TEMPORARY ORDER: AN EMERGENCY EXISTS as described in the statement below. I need a "Temporary" restraining order issued immediately without "Notice" to the Defendant until a "Hearing" to avoid irreparable injury. I request a "Temporary Order for Protection" that will:</w:t>
             </w:r>
           </w:p>
@@ -3548,79 +3055,6 @@
               <w:pStyle w:val="NoSpacing"/>
             </w:pPr>
           </w:p>
-          <w:p>
-            <w:pPr>
-              <w:pStyle w:val="NoSpacing"/>
-            </w:pPr>
-            <w:r>
-              <w:rPr>
-                <w:rFonts w:ascii="Tahoma" w:hAnsi="Tahoma" w:cs="Tahoma"/>
-              </w:rPr>
-              <w:t xml:space="preserve"> </w:t>
-            </w:r>
-            <w:r>
-              <w:t>The minors or vulnerable adults named in paragraph ___ on page ___</w:t>
-            </w:r>
-            <w:r>
-              <w:t xml:space="preserve"> </w:t>
-            </w:r>
-            <w:r>
-              <w:rPr>
-                <w:rFonts w:ascii="Aptos" w:eastAsia="Aptos" w:hAnsi="Aptos" w:cs="Aptos"/>
-                <w:sz w:val="22"/>
-                <w:szCs w:val="22"/>
-              </w:rPr>
-              <w:t>{{</w:t>
-            </w:r>
-            <w:r>
-              <w:rPr>
-                <w:rFonts w:ascii="Aptos" w:eastAsia="Aptos" w:hAnsi="Aptos" w:cs="Aptos"/>
-                <w:sz w:val="22"/>
-                <w:szCs w:val="22"/>
-              </w:rPr>
-              <w:t xml:space="preserve"> </w:t>
-            </w:r>
-            <w:r>
-              <w:rPr>
-                <w:rFonts w:ascii="Aptos" w:eastAsia="Aptos" w:hAnsi="Aptos" w:cs="Aptos"/>
-                <w:sz w:val="22"/>
-                <w:szCs w:val="22"/>
-              </w:rPr>
-              <w:t>output_checkbox(</w:t>
-            </w:r>
-            <w:r>
-              <w:rPr>
-                <w:rFonts w:ascii="Aptos" w:eastAsia="Aptos" w:hAnsi="Aptos" w:cs="Aptos"/>
-                <w:sz w:val="22"/>
-                <w:szCs w:val="22"/>
-              </w:rPr>
-              <w:t>is_</w:t>
-            </w:r>
-            <w:r>
-              <w:rPr>
-                <w:rFonts w:ascii="Aptos" w:eastAsia="Aptos" w:hAnsi="Aptos" w:cs="Aptos"/>
-                <w:sz w:val="22"/>
-                <w:szCs w:val="22"/>
-              </w:rPr>
-              <w:t>minors_or_vulnerable_adults</w:t>
-            </w:r>
-            <w:r>
-              <w:rPr>
-                <w:rFonts w:ascii="Aptos" w:eastAsia="Aptos" w:hAnsi="Aptos" w:cs="Aptos"/>
-                <w:sz w:val="22"/>
-                <w:szCs w:val="22"/>
-              </w:rPr>
-              <w:t>)</w:t>
-            </w:r>
-            <w:r>
-              <w:rPr>
-                <w:rFonts w:ascii="Aptos" w:eastAsia="Aptos" w:hAnsi="Aptos" w:cs="Aptos"/>
-                <w:sz w:val="22"/>
-                <w:szCs w:val="22"/>
-              </w:rPr>
-              <w:t xml:space="preserve"> }}</w:t>
-            </w:r>
-          </w:p>
         </w:tc>
       </w:tr>
       <w:tr>
@@ -3711,73 +3145,6 @@
               <w:pStyle w:val="NoSpacing"/>
             </w:pPr>
           </w:p>
-          <w:p>
-            <w:pPr>
-              <w:pStyle w:val="NoSpacing"/>
-              <w:rPr>
-                <w:rFonts w:ascii="Aptos" w:eastAsia="Aptos" w:hAnsi="Aptos" w:cs="Aptos"/>
-                <w:sz w:val="22"/>
-                <w:szCs w:val="22"/>
-              </w:rPr>
-            </w:pPr>
-            <w:r>
-              <w:rPr>
-                <w:rFonts w:ascii="Tahoma" w:hAnsi="Tahoma" w:cs="Tahoma"/>
-              </w:rPr>
-              <w:t xml:space="preserve"> </w:t>
-            </w:r>
-            <w:r>
-              <w:t>The minors or vulnerable adults named in paragraph ___ on page ___</w:t>
-            </w:r>
-            <w:r>
-              <w:t xml:space="preserve"> </w:t>
-            </w:r>
-            <w:r>
-              <w:rPr>
-                <w:rFonts w:ascii="Aptos" w:eastAsia="Aptos" w:hAnsi="Aptos" w:cs="Aptos"/>
-                <w:sz w:val="22"/>
-                <w:szCs w:val="22"/>
-              </w:rPr>
-              <w:t xml:space="preserve">{{ </w:t>
-            </w:r>
-            <w:r>
-              <w:rPr>
-                <w:rFonts w:ascii="Aptos" w:eastAsia="Aptos" w:hAnsi="Aptos" w:cs="Aptos"/>
-                <w:sz w:val="22"/>
-                <w:szCs w:val="22"/>
-              </w:rPr>
-              <w:t>output_checkbox(</w:t>
-            </w:r>
-            <w:r>
-              <w:rPr>
-                <w:rFonts w:ascii="Aptos" w:eastAsia="Aptos" w:hAnsi="Aptos" w:cs="Aptos"/>
-                <w:sz w:val="22"/>
-                <w:szCs w:val="22"/>
-              </w:rPr>
-              <w:t>is_minors_or_vulnerable_adults</w:t>
-            </w:r>
-            <w:r>
-              <w:rPr>
-                <w:rFonts w:ascii="Aptos" w:eastAsia="Aptos" w:hAnsi="Aptos" w:cs="Aptos"/>
-                <w:sz w:val="22"/>
-                <w:szCs w:val="22"/>
-              </w:rPr>
-              <w:t>)</w:t>
-            </w:r>
-            <w:r>
-              <w:rPr>
-                <w:rFonts w:ascii="Aptos" w:eastAsia="Aptos" w:hAnsi="Aptos" w:cs="Aptos"/>
-                <w:sz w:val="22"/>
-                <w:szCs w:val="22"/>
-              </w:rPr>
-              <w:t xml:space="preserve"> }}</w:t>
-            </w:r>
-          </w:p>
-          <w:p>
-            <w:pPr>
-              <w:pStyle w:val="NoSpacing"/>
-            </w:pPr>
-          </w:p>
         </w:tc>
       </w:tr>
       <w:tr>
@@ -3806,6 +3173,11 @@
               <w:t>EXCLUDE Defendant from ANY place I may RESIDE.</w:t>
             </w:r>
           </w:p>
+          <w:p>
+            <w:pPr>
+              <w:pStyle w:val="NoSpacing"/>
+            </w:pPr>
+          </w:p>
         </w:tc>
       </w:tr>
       <w:tr>
@@ -4129,6 +3501,11 @@
               <w:t>REMAIN EFFECTIVE longer than 1 year because Defendant is likely to resume acts of unlawful harassment AGAINST me if the order EXPIRES in 1 year.</w:t>
             </w:r>
           </w:p>
+          <w:p>
+            <w:pPr>
+              <w:pStyle w:val="NoSpacing"/>
+            </w:pPr>
+          </w:p>
         </w:tc>
       </w:tr>
       <w:tr>
@@ -4157,6 +3534,11 @@
               <w:t>REQUIRE the Defendant to pay the fees and costs of this action.</w:t>
             </w:r>
           </w:p>
+          <w:p>
+            <w:pPr>
+              <w:pStyle w:val="NoSpacing"/>
+            </w:pPr>
+          </w:p>
         </w:tc>
       </w:tr>
       <w:tr>
@@ -4241,8 +3623,7 @@
           <w:sz w:val="22"/>
           <w:szCs w:val="22"/>
         </w:rPr>
-        <w:lastRenderedPageBreak/>
-        <w:t xml:space="preserve"> </w:t>
+        <w:t xml:space="preserve">  </w:t>
       </w:r>
     </w:p>
     <w:p>
@@ -4255,7 +3636,25 @@
           <w:sz w:val="22"/>
           <w:szCs w:val="22"/>
         </w:rPr>
-        <w:t>If you request a fee waiver, describe the incident(s) involving stalking, a sex offense, or domestic violence: (Attach additional pages, if necessary.)</w:t>
+        <w:t xml:space="preserve">I certify under penalty of perjury under the laws of the </w:t>
+      </w:r>
+      <w:r>
+        <w:rPr>
+          <w:rFonts w:ascii="Aptos" w:eastAsia="Aptos" w:hAnsi="Aptos" w:cs="Aptos"/>
+          <w:b/>
+          <w:bCs/>
+          <w:sz w:val="22"/>
+          <w:szCs w:val="22"/>
+        </w:rPr>
+        <w:t xml:space="preserve">MASHPEE WAMPANOAG TRIBE </w:t>
+      </w:r>
+      <w:r>
+        <w:rPr>
+          <w:rFonts w:ascii="Aptos" w:eastAsia="Aptos" w:hAnsi="Aptos" w:cs="Aptos"/>
+          <w:sz w:val="22"/>
+          <w:szCs w:val="22"/>
+        </w:rPr>
+        <w:t>that the foregoing is true and correct.</w:t>
       </w:r>
     </w:p>
     <w:p>
@@ -4268,77 +3667,33 @@
           <w:sz w:val="22"/>
           <w:szCs w:val="22"/>
         </w:rPr>
-        <w:t>{{  statement_2  }}</w:t>
+        <w:t xml:space="preserve"> </w:t>
       </w:r>
     </w:p>
     <w:p>
       <w:pPr>
         <w:spacing w:line="259" w:lineRule="auto"/>
-      </w:pPr>
-      <w:r>
-        <w:rPr>
-          <w:rFonts w:ascii="Aptos" w:eastAsia="Aptos" w:hAnsi="Aptos" w:cs="Aptos"/>
-          <w:sz w:val="22"/>
-          <w:szCs w:val="22"/>
-        </w:rPr>
-        <w:t xml:space="preserve"> </w:t>
-      </w:r>
-    </w:p>
-    <w:p>
-      <w:pPr>
-        <w:spacing w:line="259" w:lineRule="auto"/>
-      </w:pPr>
-      <w:r>
-        <w:rPr>
-          <w:rFonts w:ascii="Aptos" w:eastAsia="Aptos" w:hAnsi="Aptos" w:cs="Aptos"/>
-          <w:sz w:val="22"/>
-          <w:szCs w:val="22"/>
-        </w:rPr>
-        <w:t xml:space="preserve">I certify under penalty of perjury under the laws of the </w:t>
-      </w:r>
-      <w:r>
-        <w:rPr>
-          <w:rFonts w:ascii="Aptos" w:eastAsia="Aptos" w:hAnsi="Aptos" w:cs="Aptos"/>
-          <w:b/>
-          <w:bCs/>
-          <w:sz w:val="22"/>
-          <w:szCs w:val="22"/>
-        </w:rPr>
-        <w:t xml:space="preserve">MASHPEE WAMPANOAG TRIBE </w:t>
-      </w:r>
-      <w:r>
-        <w:rPr>
-          <w:rFonts w:ascii="Aptos" w:eastAsia="Aptos" w:hAnsi="Aptos" w:cs="Aptos"/>
-          <w:sz w:val="22"/>
-          <w:szCs w:val="22"/>
-        </w:rPr>
-        <w:t>that the foregoing is true and correct.</w:t>
-      </w:r>
-    </w:p>
-    <w:p>
-      <w:pPr>
-        <w:spacing w:line="259" w:lineRule="auto"/>
-      </w:pPr>
-      <w:r>
-        <w:rPr>
-          <w:rFonts w:ascii="Aptos" w:eastAsia="Aptos" w:hAnsi="Aptos" w:cs="Aptos"/>
-          <w:sz w:val="22"/>
-          <w:szCs w:val="22"/>
-        </w:rPr>
-        <w:t xml:space="preserve"> </w:t>
-      </w:r>
-    </w:p>
-    <w:p>
-      <w:pPr>
-        <w:spacing w:line="259" w:lineRule="auto"/>
-      </w:pPr>
-      <w:r>
-        <w:rPr>
-          <w:rFonts w:ascii="Aptos" w:eastAsia="Aptos" w:hAnsi="Aptos" w:cs="Aptos"/>
-          <w:sz w:val="22"/>
-          <w:szCs w:val="22"/>
-        </w:rPr>
-        <w:t>DATED this  {{  statement_date  }} at {{  town_name  }}, Massachusetts.</w:t>
+        <w:rPr>
+          <w:rFonts w:ascii="Aptos" w:eastAsia="Aptos" w:hAnsi="Aptos" w:cs="Aptos"/>
+          <w:sz w:val="22"/>
+          <w:szCs w:val="22"/>
+        </w:rPr>
+      </w:pPr>
+      <w:r>
+        <w:rPr>
+          <w:rFonts w:ascii="Aptos" w:eastAsia="Aptos" w:hAnsi="Aptos" w:cs="Aptos"/>
+          <w:sz w:val="22"/>
+          <w:szCs w:val="22"/>
+        </w:rPr>
+        <w:t>DATED this  {{  statement_date  }}</w:t>
+      </w:r>
+      <w:r>
+        <w:rPr>
+          <w:rFonts w:ascii="Aptos" w:eastAsia="Aptos" w:hAnsi="Aptos" w:cs="Aptos"/>
+          <w:sz w:val="22"/>
+          <w:szCs w:val="22"/>
+        </w:rPr>
+        <w:t>.</w:t>
       </w:r>
     </w:p>
     <w:p>
@@ -4783,25 +4138,20 @@
       <w:tblGrid>
         <w:gridCol w:w="2250"/>
         <w:gridCol w:w="270"/>
-        <w:gridCol w:w="270"/>
-        <w:gridCol w:w="630"/>
-        <w:gridCol w:w="180"/>
-        <w:gridCol w:w="180"/>
+        <w:gridCol w:w="900"/>
+        <w:gridCol w:w="360"/>
         <w:gridCol w:w="90"/>
         <w:gridCol w:w="540"/>
         <w:gridCol w:w="270"/>
-        <w:gridCol w:w="90"/>
-        <w:gridCol w:w="142"/>
-        <w:gridCol w:w="308"/>
-        <w:gridCol w:w="450"/>
+        <w:gridCol w:w="232"/>
+        <w:gridCol w:w="758"/>
         <w:gridCol w:w="90"/>
         <w:gridCol w:w="270"/>
         <w:gridCol w:w="886"/>
         <w:gridCol w:w="374"/>
         <w:gridCol w:w="540"/>
         <w:gridCol w:w="90"/>
-        <w:gridCol w:w="900"/>
-        <w:gridCol w:w="810"/>
+        <w:gridCol w:w="1710"/>
         <w:gridCol w:w="1170"/>
       </w:tblGrid>
       <w:tr>
@@ -4842,7 +4192,7 @@
         <w:tc>
           <w:tcPr>
             <w:tcW w:w="8550" w:type="dxa"/>
-            <w:gridSpan w:val="21"/>
+            <w:gridSpan w:val="16"/>
             <w:tcBorders>
               <w:bottom w:val="single" w:sz="18" w:space="0" w:color="000000" w:themeColor="text1"/>
             </w:tcBorders>
@@ -4899,7 +4249,7 @@
         <w:tc>
           <w:tcPr>
             <w:tcW w:w="10800" w:type="dxa"/>
-            <w:gridSpan w:val="22"/>
+            <w:gridSpan w:val="17"/>
             <w:tcBorders>
               <w:top w:val="single" w:sz="18" w:space="0" w:color="000000" w:themeColor="text1"/>
               <w:left w:val="single" w:sz="18" w:space="0" w:color="000000" w:themeColor="text1"/>
@@ -4964,7 +4314,7 @@
         <w:tc>
           <w:tcPr>
             <w:tcW w:w="4912" w:type="dxa"/>
-            <w:gridSpan w:val="11"/>
+            <w:gridSpan w:val="8"/>
             <w:tcBorders>
               <w:top w:val="single" w:sz="18" w:space="0" w:color="000000" w:themeColor="text1"/>
               <w:left w:val="single" w:sz="18" w:space="0" w:color="000000" w:themeColor="text1"/>
@@ -4990,7 +4340,7 @@
         <w:tc>
           <w:tcPr>
             <w:tcW w:w="5888" w:type="dxa"/>
-            <w:gridSpan w:val="11"/>
+            <w:gridSpan w:val="9"/>
             <w:tcBorders>
               <w:top w:val="single" w:sz="18" w:space="0" w:color="000000" w:themeColor="text1"/>
               <w:right w:val="single" w:sz="18" w:space="0" w:color="000000" w:themeColor="text1"/>
@@ -5036,7 +4386,7 @@
         <w:tc>
           <w:tcPr>
             <w:tcW w:w="10800" w:type="dxa"/>
-            <w:gridSpan w:val="22"/>
+            <w:gridSpan w:val="17"/>
             <w:tcBorders>
               <w:left w:val="single" w:sz="18" w:space="0" w:color="000000" w:themeColor="text1"/>
               <w:right w:val="single" w:sz="18" w:space="0" w:color="000000" w:themeColor="text1"/>
@@ -5378,7 +4728,7 @@
         <w:tc>
           <w:tcPr>
             <w:tcW w:w="10800" w:type="dxa"/>
-            <w:gridSpan w:val="22"/>
+            <w:gridSpan w:val="17"/>
             <w:tcBorders>
               <w:top w:val="single" w:sz="18" w:space="0" w:color="000000" w:themeColor="text1"/>
             </w:tcBorders>
@@ -5414,7 +4764,7 @@
         <w:tc>
           <w:tcPr>
             <w:tcW w:w="3870" w:type="dxa"/>
-            <w:gridSpan w:val="7"/>
+            <w:gridSpan w:val="5"/>
           </w:tcPr>
           <w:p>
             <w:pPr>
@@ -5468,7 +4818,7 @@
         <w:tc>
           <w:tcPr>
             <w:tcW w:w="3046" w:type="dxa"/>
-            <w:gridSpan w:val="9"/>
+            <w:gridSpan w:val="7"/>
           </w:tcPr>
           <w:p>
             <w:pPr>
@@ -5527,7 +4877,7 @@
         <w:tc>
           <w:tcPr>
             <w:tcW w:w="3884" w:type="dxa"/>
-            <w:gridSpan w:val="6"/>
+            <w:gridSpan w:val="5"/>
           </w:tcPr>
           <w:p>
             <w:pPr>
@@ -5722,7 +5072,7 @@
         <w:tc>
           <w:tcPr>
             <w:tcW w:w="1350" w:type="dxa"/>
-            <w:gridSpan w:val="5"/>
+            <w:gridSpan w:val="3"/>
           </w:tcPr>
           <w:p>
             <w:pPr>
@@ -5797,7 +5147,7 @@
         <w:tc>
           <w:tcPr>
             <w:tcW w:w="1890" w:type="dxa"/>
-            <w:gridSpan w:val="7"/>
+            <w:gridSpan w:val="5"/>
           </w:tcPr>
           <w:p>
             <w:pPr>
@@ -5871,7 +5221,7 @@
         <w:tc>
           <w:tcPr>
             <w:tcW w:w="2880" w:type="dxa"/>
-            <w:gridSpan w:val="3"/>
+            <w:gridSpan w:val="2"/>
           </w:tcPr>
           <w:p>
             <w:pPr>
@@ -5913,7 +5263,7 @@
         <w:tc>
           <w:tcPr>
             <w:tcW w:w="3870" w:type="dxa"/>
-            <w:gridSpan w:val="7"/>
+            <w:gridSpan w:val="5"/>
           </w:tcPr>
           <w:p>
             <w:pPr>
@@ -5958,7 +5308,7 @@
         <w:tc>
           <w:tcPr>
             <w:tcW w:w="1890" w:type="dxa"/>
-            <w:gridSpan w:val="7"/>
+            <w:gridSpan w:val="5"/>
           </w:tcPr>
           <w:p>
             <w:pPr>
@@ -6032,7 +5382,7 @@
         <w:tc>
           <w:tcPr>
             <w:tcW w:w="2880" w:type="dxa"/>
-            <w:gridSpan w:val="3"/>
+            <w:gridSpan w:val="2"/>
           </w:tcPr>
           <w:p>
             <w:pPr>
@@ -6074,7 +5424,7 @@
         <w:tc>
           <w:tcPr>
             <w:tcW w:w="3870" w:type="dxa"/>
-            <w:gridSpan w:val="7"/>
+            <w:gridSpan w:val="5"/>
           </w:tcPr>
           <w:p>
             <w:pPr>
@@ -6126,7 +5476,7 @@
         <w:tc>
           <w:tcPr>
             <w:tcW w:w="4050" w:type="dxa"/>
-            <w:gridSpan w:val="12"/>
+            <w:gridSpan w:val="10"/>
           </w:tcPr>
           <w:p>
             <w:pPr>
@@ -6184,7 +5534,7 @@
         <w:tc>
           <w:tcPr>
             <w:tcW w:w="2880" w:type="dxa"/>
-            <w:gridSpan w:val="3"/>
+            <w:gridSpan w:val="2"/>
           </w:tcPr>
           <w:p>
             <w:pPr>
@@ -6440,7 +5790,7 @@
         <w:tc>
           <w:tcPr>
             <w:tcW w:w="3870" w:type="dxa"/>
-            <w:gridSpan w:val="7"/>
+            <w:gridSpan w:val="5"/>
           </w:tcPr>
           <w:p>
             <w:pPr>
@@ -6487,7 +5837,7 @@
         <w:tc>
           <w:tcPr>
             <w:tcW w:w="4050" w:type="dxa"/>
-            <w:gridSpan w:val="12"/>
+            <w:gridSpan w:val="10"/>
           </w:tcPr>
           <w:p>
             <w:pPr>
@@ -6524,7 +5874,7 @@
         <w:tc>
           <w:tcPr>
             <w:tcW w:w="2880" w:type="dxa"/>
-            <w:gridSpan w:val="3"/>
+            <w:gridSpan w:val="2"/>
           </w:tcPr>
           <w:p>
             <w:pPr>
@@ -6684,7 +6034,7 @@
         <w:tc>
           <w:tcPr>
             <w:tcW w:w="2160" w:type="dxa"/>
-            <w:gridSpan w:val="7"/>
+            <w:gridSpan w:val="5"/>
           </w:tcPr>
           <w:p>
             <w:pPr>
@@ -6732,7 +6082,7 @@
         <w:tc>
           <w:tcPr>
             <w:tcW w:w="1350" w:type="dxa"/>
-            <w:gridSpan w:val="6"/>
+            <w:gridSpan w:val="4"/>
           </w:tcPr>
           <w:p>
             <w:pPr>
@@ -6810,7 +6160,7 @@
         <w:tc>
           <w:tcPr>
             <w:tcW w:w="2340" w:type="dxa"/>
-            <w:gridSpan w:val="4"/>
+            <w:gridSpan w:val="3"/>
           </w:tcPr>
           <w:p>
             <w:pPr>
@@ -6922,7 +6272,7 @@
         <w:tc>
           <w:tcPr>
             <w:tcW w:w="10800" w:type="dxa"/>
-            <w:gridSpan w:val="22"/>
+            <w:gridSpan w:val="17"/>
           </w:tcPr>
           <w:p>
             <w:pPr>
@@ -8224,7 +7574,7 @@
         <w:tc>
           <w:tcPr>
             <w:tcW w:w="10800" w:type="dxa"/>
-            <w:gridSpan w:val="22"/>
+            <w:gridSpan w:val="17"/>
           </w:tcPr>
           <w:p>
             <w:pPr>
@@ -9420,7 +8770,7 @@
         <w:tc>
           <w:tcPr>
             <w:tcW w:w="10800" w:type="dxa"/>
-            <w:gridSpan w:val="22"/>
+            <w:gridSpan w:val="17"/>
             <w:tcBorders>
               <w:top w:val="single" w:sz="18" w:space="0" w:color="000000" w:themeColor="text1"/>
               <w:left w:val="single" w:sz="2" w:space="0" w:color="000000" w:themeColor="text1"/>
@@ -9462,7 +8812,7 @@
         <w:tc>
           <w:tcPr>
             <w:tcW w:w="10800" w:type="dxa"/>
-            <w:gridSpan w:val="22"/>
+            <w:gridSpan w:val="17"/>
             <w:tcBorders>
               <w:top w:val="single" w:sz="4" w:space="0" w:color="auto"/>
               <w:left w:val="single" w:sz="2" w:space="0" w:color="000000" w:themeColor="text1"/>
@@ -9666,7 +9016,7 @@
         <w:tc>
           <w:tcPr>
             <w:tcW w:w="1260" w:type="dxa"/>
-            <w:gridSpan w:val="4"/>
+            <w:gridSpan w:val="2"/>
             <w:tcBorders>
               <w:top w:val="single" w:sz="4" w:space="0" w:color="auto"/>
             </w:tcBorders>
@@ -9722,7 +9072,7 @@
         <w:tc>
           <w:tcPr>
             <w:tcW w:w="1890" w:type="dxa"/>
-            <w:gridSpan w:val="7"/>
+            <w:gridSpan w:val="5"/>
             <w:tcBorders>
               <w:top w:val="single" w:sz="4" w:space="0" w:color="auto"/>
             </w:tcBorders>
@@ -9813,7 +9163,7 @@
         <w:tc>
           <w:tcPr>
             <w:tcW w:w="2970" w:type="dxa"/>
-            <w:gridSpan w:val="4"/>
+            <w:gridSpan w:val="3"/>
             <w:tcBorders>
               <w:top w:val="single" w:sz="4" w:space="0" w:color="auto"/>
               <w:right w:val="single" w:sz="2" w:space="0" w:color="000000" w:themeColor="text1"/>
@@ -9863,7 +9213,7 @@
         <w:tc>
           <w:tcPr>
             <w:tcW w:w="3780" w:type="dxa"/>
-            <w:gridSpan w:val="6"/>
+            <w:gridSpan w:val="4"/>
             <w:tcBorders>
               <w:top w:val="single" w:sz="4" w:space="0" w:color="auto"/>
               <w:left w:val="single" w:sz="2" w:space="0" w:color="000000" w:themeColor="text1"/>
@@ -9936,7 +9286,7 @@
         <w:tc>
           <w:tcPr>
             <w:tcW w:w="1890" w:type="dxa"/>
-            <w:gridSpan w:val="7"/>
+            <w:gridSpan w:val="5"/>
             <w:tcBorders>
               <w:top w:val="single" w:sz="4" w:space="0" w:color="auto"/>
             </w:tcBorders>
@@ -10036,7 +9386,7 @@
         <w:tc>
           <w:tcPr>
             <w:tcW w:w="2970" w:type="dxa"/>
-            <w:gridSpan w:val="4"/>
+            <w:gridSpan w:val="3"/>
             <w:tcBorders>
               <w:top w:val="single" w:sz="4" w:space="0" w:color="auto"/>
               <w:right w:val="single" w:sz="2" w:space="0" w:color="000000" w:themeColor="text1"/>
@@ -10086,7 +9436,7 @@
         <w:tc>
           <w:tcPr>
             <w:tcW w:w="10800" w:type="dxa"/>
-            <w:gridSpan w:val="22"/>
+            <w:gridSpan w:val="17"/>
             <w:tcBorders>
               <w:left w:val="single" w:sz="2" w:space="0" w:color="000000" w:themeColor="text1"/>
               <w:right w:val="single" w:sz="2" w:space="0" w:color="000000" w:themeColor="text1"/>
@@ -10136,7 +9486,7 @@
         <w:tc>
           <w:tcPr>
             <w:tcW w:w="4410" w:type="dxa"/>
-            <w:gridSpan w:val="8"/>
+            <w:gridSpan w:val="6"/>
             <w:tcBorders>
               <w:left w:val="single" w:sz="2" w:space="0" w:color="000000" w:themeColor="text1"/>
             </w:tcBorders>
@@ -10196,7 +9546,7 @@
         <w:tc>
           <w:tcPr>
             <w:tcW w:w="2506" w:type="dxa"/>
-            <w:gridSpan w:val="8"/>
+            <w:gridSpan w:val="6"/>
           </w:tcPr>
           <w:p>
             <w:pPr>
@@ -10239,7 +9589,7 @@
         <w:tc>
           <w:tcPr>
             <w:tcW w:w="3884" w:type="dxa"/>
-            <w:gridSpan w:val="6"/>
+            <w:gridSpan w:val="5"/>
             <w:tcBorders>
               <w:right w:val="single" w:sz="2" w:space="0" w:color="000000" w:themeColor="text1"/>
             </w:tcBorders>
@@ -10515,7 +9865,7 @@
         <w:tc>
           <w:tcPr>
             <w:tcW w:w="10800" w:type="dxa"/>
-            <w:gridSpan w:val="22"/>
+            <w:gridSpan w:val="17"/>
             <w:tcBorders>
               <w:left w:val="single" w:sz="2" w:space="0" w:color="000000" w:themeColor="text1"/>
               <w:right w:val="single" w:sz="2" w:space="0" w:color="000000" w:themeColor="text1"/>
@@ -10565,7 +9915,7 @@
         <w:tc>
           <w:tcPr>
             <w:tcW w:w="3420" w:type="dxa"/>
-            <w:gridSpan w:val="4"/>
+            <w:gridSpan w:val="3"/>
             <w:tcBorders>
               <w:left w:val="single" w:sz="2" w:space="0" w:color="000000" w:themeColor="text1"/>
             </w:tcBorders>
@@ -10638,7 +9988,7 @@
         <w:tc>
           <w:tcPr>
             <w:tcW w:w="3870" w:type="dxa"/>
-            <w:gridSpan w:val="13"/>
+            <w:gridSpan w:val="10"/>
           </w:tcPr>
           <w:p>
             <w:pPr>
@@ -10711,7 +10061,7 @@
         <w:tc>
           <w:tcPr>
             <w:tcW w:w="3510" w:type="dxa"/>
-            <w:gridSpan w:val="5"/>
+            <w:gridSpan w:val="4"/>
             <w:tcBorders>
               <w:right w:val="single" w:sz="2" w:space="0" w:color="000000" w:themeColor="text1"/>
             </w:tcBorders>
@@ -10742,7 +10092,7 @@
         <w:tc>
           <w:tcPr>
             <w:tcW w:w="10800" w:type="dxa"/>
-            <w:gridSpan w:val="22"/>
+            <w:gridSpan w:val="17"/>
             <w:tcBorders>
               <w:left w:val="single" w:sz="2" w:space="0" w:color="000000" w:themeColor="text1"/>
               <w:bottom w:val="single" w:sz="18" w:space="0" w:color="000000" w:themeColor="text1"/>
@@ -10876,1070 +10226,6 @@
                 <w:sz w:val="22"/>
                 <w:szCs w:val="22"/>
               </w:rPr>
-            </w:pPr>
-          </w:p>
-        </w:tc>
-      </w:tr>
-      <w:tr>
-        <w:trPr>
-          <w:trHeight w:val="300"/>
-        </w:trPr>
-        <w:tc>
-          <w:tcPr>
-            <w:tcW w:w="2790" w:type="dxa"/>
-            <w:gridSpan w:val="3"/>
-            <w:tcBorders>
-              <w:top w:val="single" w:sz="18" w:space="0" w:color="000000" w:themeColor="text1"/>
-              <w:left w:val="single" w:sz="2" w:space="0" w:color="000000" w:themeColor="text1"/>
-              <w:bottom w:val="single" w:sz="2" w:space="0" w:color="000000" w:themeColor="text1"/>
-              <w:right w:val="single" w:sz="2" w:space="0" w:color="000000" w:themeColor="text1"/>
-            </w:tcBorders>
-          </w:tcPr>
-          <w:p>
-            <w:pPr>
-              <w:pStyle w:val="NoSpacing"/>
-              <w:rPr>
-                <w:b/>
-                <w:bCs/>
-                <w:sz w:val="22"/>
-                <w:szCs w:val="22"/>
-              </w:rPr>
-            </w:pPr>
-            <w:r>
-              <w:rPr>
-                <w:b/>
-                <w:bCs/>
-                <w:sz w:val="22"/>
-                <w:szCs w:val="22"/>
-              </w:rPr>
-              <w:lastRenderedPageBreak/>
-              <w:t>Minor’s Information</w:t>
-            </w:r>
-          </w:p>
-        </w:tc>
-        <w:tc>
-          <w:tcPr>
-            <w:tcW w:w="4500" w:type="dxa"/>
-            <w:gridSpan w:val="14"/>
-            <w:tcBorders>
-              <w:top w:val="single" w:sz="18" w:space="0" w:color="000000" w:themeColor="text1"/>
-              <w:left w:val="single" w:sz="2" w:space="0" w:color="000000" w:themeColor="text1"/>
-              <w:bottom w:val="single" w:sz="2" w:space="0" w:color="000000" w:themeColor="text1"/>
-              <w:right w:val="single" w:sz="2" w:space="0" w:color="000000" w:themeColor="text1"/>
-            </w:tcBorders>
-          </w:tcPr>
-          <w:p>
-            <w:pPr>
-              <w:pStyle w:val="NoSpacing"/>
-              <w:rPr>
-                <w:b/>
-                <w:bCs/>
-                <w:sz w:val="22"/>
-                <w:szCs w:val="22"/>
-              </w:rPr>
-            </w:pPr>
-            <w:r>
-              <w:rPr>
-                <w:b/>
-                <w:bCs/>
-                <w:sz w:val="22"/>
-                <w:szCs w:val="22"/>
-              </w:rPr>
-              <w:t xml:space="preserve">Describe the minor’s relationship using terms </w:t>
-            </w:r>
-            <w:r>
-              <w:rPr>
-                <w:b/>
-                <w:bCs/>
-                <w:sz w:val="22"/>
-                <w:szCs w:val="22"/>
-              </w:rPr>
-              <w:t>such as</w:t>
-            </w:r>
-            <w:r>
-              <w:rPr>
-                <w:b/>
-                <w:bCs/>
-                <w:sz w:val="22"/>
-                <w:szCs w:val="22"/>
-              </w:rPr>
-              <w:t xml:space="preserve"> child, grandchild, stepchild, nephew, none</w:t>
-            </w:r>
-          </w:p>
-        </w:tc>
-        <w:tc>
-          <w:tcPr>
-            <w:tcW w:w="3510" w:type="dxa"/>
-            <w:gridSpan w:val="5"/>
-            <w:tcBorders>
-              <w:top w:val="single" w:sz="18" w:space="0" w:color="000000" w:themeColor="text1"/>
-              <w:left w:val="single" w:sz="2" w:space="0" w:color="000000" w:themeColor="text1"/>
-              <w:bottom w:val="single" w:sz="2" w:space="0" w:color="000000" w:themeColor="text1"/>
-              <w:right w:val="single" w:sz="2" w:space="0" w:color="000000" w:themeColor="text1"/>
-            </w:tcBorders>
-          </w:tcPr>
-          <w:p>
-            <w:pPr>
-              <w:pStyle w:val="NoSpacing"/>
-              <w:rPr>
-                <w:b/>
-                <w:bCs/>
-                <w:sz w:val="22"/>
-                <w:szCs w:val="22"/>
-              </w:rPr>
-            </w:pPr>
-            <w:r>
-              <w:rPr>
-                <w:b/>
-                <w:bCs/>
-                <w:sz w:val="22"/>
-                <w:szCs w:val="22"/>
-              </w:rPr>
-              <w:t>Minor’s Relationship to:</w:t>
-            </w:r>
-          </w:p>
-        </w:tc>
-      </w:tr>
-      <w:tr>
-        <w:trPr>
-          <w:trHeight w:val="300"/>
-        </w:trPr>
-        <w:tc>
-          <w:tcPr>
-            <w:tcW w:w="2790" w:type="dxa"/>
-            <w:gridSpan w:val="3"/>
-            <w:tcBorders>
-              <w:top w:val="single" w:sz="2" w:space="0" w:color="000000" w:themeColor="text1"/>
-              <w:left w:val="single" w:sz="2" w:space="0" w:color="000000" w:themeColor="text1"/>
-              <w:bottom w:val="single" w:sz="2" w:space="0" w:color="000000" w:themeColor="text1"/>
-              <w:right w:val="single" w:sz="2" w:space="0" w:color="000000" w:themeColor="text1"/>
-            </w:tcBorders>
-          </w:tcPr>
-          <w:p>
-            <w:pPr>
-              <w:pStyle w:val="NoSpacing"/>
-              <w:rPr>
-                <w:b/>
-                <w:bCs/>
-                <w:sz w:val="22"/>
-                <w:szCs w:val="22"/>
-              </w:rPr>
-            </w:pPr>
-            <w:r>
-              <w:rPr>
-                <w:b/>
-                <w:bCs/>
-                <w:sz w:val="22"/>
-                <w:szCs w:val="22"/>
-              </w:rPr>
-              <w:t>Full Name:</w:t>
-            </w:r>
-          </w:p>
-        </w:tc>
-        <w:tc>
-          <w:tcPr>
-            <w:tcW w:w="810" w:type="dxa"/>
-            <w:gridSpan w:val="2"/>
-            <w:tcBorders>
-              <w:top w:val="single" w:sz="2" w:space="0" w:color="000000" w:themeColor="text1"/>
-              <w:left w:val="single" w:sz="2" w:space="0" w:color="000000" w:themeColor="text1"/>
-              <w:bottom w:val="single" w:sz="2" w:space="0" w:color="000000" w:themeColor="text1"/>
-              <w:right w:val="single" w:sz="2" w:space="0" w:color="000000" w:themeColor="text1"/>
-            </w:tcBorders>
-          </w:tcPr>
-          <w:p>
-            <w:pPr>
-              <w:pStyle w:val="NoSpacing"/>
-              <w:rPr>
-                <w:sz w:val="22"/>
-                <w:szCs w:val="22"/>
-              </w:rPr>
-            </w:pPr>
-            <w:r>
-              <w:rPr>
-                <w:sz w:val="22"/>
-                <w:szCs w:val="22"/>
-              </w:rPr>
-              <w:t>Sex</w:t>
-            </w:r>
-          </w:p>
-        </w:tc>
-        <w:tc>
-          <w:tcPr>
-            <w:tcW w:w="1170" w:type="dxa"/>
-            <w:gridSpan w:val="5"/>
-            <w:tcBorders>
-              <w:top w:val="single" w:sz="2" w:space="0" w:color="000000" w:themeColor="text1"/>
-              <w:left w:val="single" w:sz="2" w:space="0" w:color="000000" w:themeColor="text1"/>
-              <w:bottom w:val="single" w:sz="2" w:space="0" w:color="000000" w:themeColor="text1"/>
-              <w:right w:val="single" w:sz="2" w:space="0" w:color="000000" w:themeColor="text1"/>
-            </w:tcBorders>
-          </w:tcPr>
-          <w:p>
-            <w:pPr>
-              <w:pStyle w:val="NoSpacing"/>
-              <w:rPr>
-                <w:sz w:val="22"/>
-                <w:szCs w:val="22"/>
-              </w:rPr>
-            </w:pPr>
-            <w:r>
-              <w:rPr>
-                <w:sz w:val="22"/>
-                <w:szCs w:val="22"/>
-              </w:rPr>
-              <w:t>Race</w:t>
-            </w:r>
-          </w:p>
-        </w:tc>
-        <w:tc>
-          <w:tcPr>
-            <w:tcW w:w="1260" w:type="dxa"/>
-            <w:gridSpan w:val="5"/>
-            <w:tcBorders>
-              <w:top w:val="single" w:sz="2" w:space="0" w:color="000000" w:themeColor="text1"/>
-              <w:left w:val="single" w:sz="2" w:space="0" w:color="000000" w:themeColor="text1"/>
-              <w:bottom w:val="single" w:sz="2" w:space="0" w:color="000000" w:themeColor="text1"/>
-              <w:right w:val="single" w:sz="2" w:space="0" w:color="000000" w:themeColor="text1"/>
-            </w:tcBorders>
-          </w:tcPr>
-          <w:p>
-            <w:pPr>
-              <w:pStyle w:val="NoSpacing"/>
-              <w:rPr>
-                <w:sz w:val="22"/>
-                <w:szCs w:val="22"/>
-              </w:rPr>
-            </w:pPr>
-            <w:r>
-              <w:rPr>
-                <w:sz w:val="22"/>
-                <w:szCs w:val="22"/>
-              </w:rPr>
-              <w:t>Birth date</w:t>
-            </w:r>
-          </w:p>
-        </w:tc>
-        <w:tc>
-          <w:tcPr>
-            <w:tcW w:w="1260" w:type="dxa"/>
-            <w:gridSpan w:val="2"/>
-            <w:tcBorders>
-              <w:top w:val="single" w:sz="2" w:space="0" w:color="000000" w:themeColor="text1"/>
-              <w:left w:val="single" w:sz="2" w:space="0" w:color="000000" w:themeColor="text1"/>
-              <w:bottom w:val="single" w:sz="2" w:space="0" w:color="000000" w:themeColor="text1"/>
-              <w:right w:val="single" w:sz="2" w:space="0" w:color="000000" w:themeColor="text1"/>
-            </w:tcBorders>
-          </w:tcPr>
-          <w:p>
-            <w:pPr>
-              <w:pStyle w:val="NoSpacing"/>
-              <w:rPr>
-                <w:sz w:val="22"/>
-                <w:szCs w:val="22"/>
-              </w:rPr>
-            </w:pPr>
-            <w:r>
-              <w:rPr>
-                <w:sz w:val="22"/>
-                <w:szCs w:val="22"/>
-              </w:rPr>
-              <w:t>Resides With</w:t>
-            </w:r>
-          </w:p>
-        </w:tc>
-        <w:tc>
-          <w:tcPr>
-            <w:tcW w:w="1530" w:type="dxa"/>
-            <w:gridSpan w:val="3"/>
-            <w:tcBorders>
-              <w:top w:val="single" w:sz="2" w:space="0" w:color="000000" w:themeColor="text1"/>
-              <w:left w:val="single" w:sz="2" w:space="0" w:color="000000" w:themeColor="text1"/>
-              <w:bottom w:val="single" w:sz="2" w:space="0" w:color="000000" w:themeColor="text1"/>
-              <w:right w:val="single" w:sz="2" w:space="0" w:color="000000" w:themeColor="text1"/>
-            </w:tcBorders>
-          </w:tcPr>
-          <w:p>
-            <w:pPr>
-              <w:pStyle w:val="NoSpacing"/>
-              <w:rPr>
-                <w:sz w:val="22"/>
-                <w:szCs w:val="22"/>
-              </w:rPr>
-            </w:pPr>
-            <w:r>
-              <w:rPr>
-                <w:sz w:val="22"/>
-                <w:szCs w:val="22"/>
-              </w:rPr>
-              <w:t>Protected Person</w:t>
-            </w:r>
-          </w:p>
-        </w:tc>
-        <w:tc>
-          <w:tcPr>
-            <w:tcW w:w="1980" w:type="dxa"/>
-            <w:gridSpan w:val="2"/>
-            <w:tcBorders>
-              <w:top w:val="single" w:sz="2" w:space="0" w:color="000000" w:themeColor="text1"/>
-              <w:left w:val="single" w:sz="2" w:space="0" w:color="000000" w:themeColor="text1"/>
-              <w:bottom w:val="single" w:sz="2" w:space="0" w:color="000000" w:themeColor="text1"/>
-              <w:right w:val="single" w:sz="2" w:space="0" w:color="000000" w:themeColor="text1"/>
-            </w:tcBorders>
-          </w:tcPr>
-          <w:p>
-            <w:pPr>
-              <w:pStyle w:val="NoSpacing"/>
-              <w:rPr>
-                <w:sz w:val="22"/>
-                <w:szCs w:val="22"/>
-              </w:rPr>
-            </w:pPr>
-            <w:r>
-              <w:rPr>
-                <w:sz w:val="22"/>
-                <w:szCs w:val="22"/>
-              </w:rPr>
-              <w:t>Restrained Person</w:t>
-            </w:r>
-          </w:p>
-        </w:tc>
-      </w:tr>
-      <w:tr>
-        <w:trPr>
-          <w:trHeight w:val="300"/>
-        </w:trPr>
-        <w:tc>
-          <w:tcPr>
-            <w:tcW w:w="2790" w:type="dxa"/>
-            <w:gridSpan w:val="3"/>
-            <w:tcBorders>
-              <w:top w:val="single" w:sz="2" w:space="0" w:color="000000" w:themeColor="text1"/>
-              <w:left w:val="single" w:sz="2" w:space="0" w:color="000000" w:themeColor="text1"/>
-              <w:bottom w:val="single" w:sz="2" w:space="0" w:color="000000" w:themeColor="text1"/>
-              <w:right w:val="single" w:sz="2" w:space="0" w:color="000000" w:themeColor="text1"/>
-            </w:tcBorders>
-          </w:tcPr>
-          <w:p>
-            <w:pPr>
-              <w:rPr>
-                <w:rFonts w:ascii="Aptos" w:eastAsia="Aptos" w:hAnsi="Aptos" w:cs="Aptos"/>
-                <w:sz w:val="22"/>
-                <w:szCs w:val="22"/>
-              </w:rPr>
-            </w:pPr>
-            <w:r>
-              <w:rPr>
-                <w:rFonts w:ascii="Aptos" w:eastAsia="Aptos" w:hAnsi="Aptos" w:cs="Aptos"/>
-                <w:sz w:val="22"/>
-                <w:szCs w:val="22"/>
-              </w:rPr>
-              <w:t>{%tr for child in minor %}</w:t>
-            </w:r>
-          </w:p>
-        </w:tc>
-        <w:tc>
-          <w:tcPr>
-            <w:tcW w:w="810" w:type="dxa"/>
-            <w:gridSpan w:val="2"/>
-            <w:tcBorders>
-              <w:top w:val="single" w:sz="2" w:space="0" w:color="000000" w:themeColor="text1"/>
-              <w:left w:val="single" w:sz="2" w:space="0" w:color="000000" w:themeColor="text1"/>
-              <w:bottom w:val="single" w:sz="2" w:space="0" w:color="000000" w:themeColor="text1"/>
-              <w:right w:val="single" w:sz="2" w:space="0" w:color="000000" w:themeColor="text1"/>
-            </w:tcBorders>
-          </w:tcPr>
-          <w:p>
-            <w:pPr>
-              <w:pStyle w:val="NoSpacing"/>
-              <w:rPr>
-                <w:sz w:val="22"/>
-                <w:szCs w:val="22"/>
-              </w:rPr>
-            </w:pPr>
-          </w:p>
-        </w:tc>
-        <w:tc>
-          <w:tcPr>
-            <w:tcW w:w="1170" w:type="dxa"/>
-            <w:gridSpan w:val="5"/>
-            <w:tcBorders>
-              <w:top w:val="single" w:sz="2" w:space="0" w:color="000000" w:themeColor="text1"/>
-              <w:left w:val="single" w:sz="2" w:space="0" w:color="000000" w:themeColor="text1"/>
-              <w:bottom w:val="single" w:sz="2" w:space="0" w:color="000000" w:themeColor="text1"/>
-              <w:right w:val="single" w:sz="2" w:space="0" w:color="000000" w:themeColor="text1"/>
-            </w:tcBorders>
-          </w:tcPr>
-          <w:p>
-            <w:pPr>
-              <w:pStyle w:val="NoSpacing"/>
-              <w:rPr>
-                <w:rFonts w:ascii="Aptos" w:eastAsia="Aptos" w:hAnsi="Aptos" w:cs="Aptos"/>
-                <w:sz w:val="22"/>
-                <w:szCs w:val="22"/>
-              </w:rPr>
-            </w:pPr>
-          </w:p>
-        </w:tc>
-        <w:tc>
-          <w:tcPr>
-            <w:tcW w:w="1260" w:type="dxa"/>
-            <w:gridSpan w:val="5"/>
-            <w:tcBorders>
-              <w:top w:val="single" w:sz="2" w:space="0" w:color="000000" w:themeColor="text1"/>
-              <w:left w:val="single" w:sz="2" w:space="0" w:color="000000" w:themeColor="text1"/>
-              <w:bottom w:val="single" w:sz="2" w:space="0" w:color="000000" w:themeColor="text1"/>
-              <w:right w:val="single" w:sz="2" w:space="0" w:color="000000" w:themeColor="text1"/>
-            </w:tcBorders>
-          </w:tcPr>
-          <w:p>
-            <w:pPr>
-              <w:pStyle w:val="NoSpacing"/>
-              <w:rPr>
-                <w:rFonts w:ascii="Aptos" w:eastAsia="Aptos" w:hAnsi="Aptos" w:cs="Aptos"/>
-                <w:sz w:val="22"/>
-                <w:szCs w:val="22"/>
-              </w:rPr>
-            </w:pPr>
-          </w:p>
-        </w:tc>
-        <w:tc>
-          <w:tcPr>
-            <w:tcW w:w="1260" w:type="dxa"/>
-            <w:gridSpan w:val="2"/>
-            <w:tcBorders>
-              <w:top w:val="single" w:sz="2" w:space="0" w:color="000000" w:themeColor="text1"/>
-              <w:left w:val="single" w:sz="2" w:space="0" w:color="000000" w:themeColor="text1"/>
-              <w:bottom w:val="single" w:sz="2" w:space="0" w:color="000000" w:themeColor="text1"/>
-              <w:right w:val="single" w:sz="2" w:space="0" w:color="000000" w:themeColor="text1"/>
-            </w:tcBorders>
-          </w:tcPr>
-          <w:p>
-            <w:pPr>
-              <w:pStyle w:val="NoSpacing"/>
-              <w:rPr>
-                <w:sz w:val="22"/>
-                <w:szCs w:val="22"/>
-              </w:rPr>
-            </w:pPr>
-          </w:p>
-        </w:tc>
-        <w:tc>
-          <w:tcPr>
-            <w:tcW w:w="1530" w:type="dxa"/>
-            <w:gridSpan w:val="3"/>
-            <w:tcBorders>
-              <w:top w:val="single" w:sz="2" w:space="0" w:color="000000" w:themeColor="text1"/>
-              <w:left w:val="single" w:sz="2" w:space="0" w:color="000000" w:themeColor="text1"/>
-              <w:bottom w:val="single" w:sz="2" w:space="0" w:color="000000" w:themeColor="text1"/>
-              <w:right w:val="single" w:sz="2" w:space="0" w:color="000000" w:themeColor="text1"/>
-            </w:tcBorders>
-          </w:tcPr>
-          <w:p>
-            <w:pPr>
-              <w:pStyle w:val="NoSpacing"/>
-              <w:rPr>
-                <w:sz w:val="22"/>
-                <w:szCs w:val="22"/>
-              </w:rPr>
-            </w:pPr>
-          </w:p>
-        </w:tc>
-        <w:tc>
-          <w:tcPr>
-            <w:tcW w:w="1980" w:type="dxa"/>
-            <w:gridSpan w:val="2"/>
-            <w:tcBorders>
-              <w:top w:val="single" w:sz="2" w:space="0" w:color="000000" w:themeColor="text1"/>
-              <w:left w:val="single" w:sz="2" w:space="0" w:color="000000" w:themeColor="text1"/>
-              <w:bottom w:val="single" w:sz="2" w:space="0" w:color="000000" w:themeColor="text1"/>
-              <w:right w:val="single" w:sz="2" w:space="0" w:color="000000" w:themeColor="text1"/>
-            </w:tcBorders>
-          </w:tcPr>
-          <w:p>
-            <w:pPr>
-              <w:pStyle w:val="NoSpacing"/>
-              <w:rPr>
-                <w:sz w:val="22"/>
-                <w:szCs w:val="22"/>
-              </w:rPr>
-            </w:pPr>
-          </w:p>
-        </w:tc>
-      </w:tr>
-      <w:tr>
-        <w:trPr>
-          <w:trHeight w:val="300"/>
-        </w:trPr>
-        <w:tc>
-          <w:tcPr>
-            <w:tcW w:w="2790" w:type="dxa"/>
-            <w:gridSpan w:val="3"/>
-            <w:tcBorders>
-              <w:top w:val="single" w:sz="2" w:space="0" w:color="000000" w:themeColor="text1"/>
-              <w:left w:val="single" w:sz="2" w:space="0" w:color="000000" w:themeColor="text1"/>
-              <w:bottom w:val="single" w:sz="2" w:space="0" w:color="000000" w:themeColor="text1"/>
-              <w:right w:val="single" w:sz="2" w:space="0" w:color="000000" w:themeColor="text1"/>
-            </w:tcBorders>
-          </w:tcPr>
-          <w:p>
-            <w:pPr>
-              <w:pStyle w:val="NoSpacing"/>
-              <w:rPr>
-                <w:rFonts w:ascii="Aptos" w:eastAsia="Aptos" w:hAnsi="Aptos" w:cs="Aptos"/>
-                <w:sz w:val="22"/>
-                <w:szCs w:val="22"/>
-              </w:rPr>
-            </w:pPr>
-            <w:r>
-              <w:rPr>
-                <w:rFonts w:ascii="Aptos" w:eastAsia="Aptos" w:hAnsi="Aptos" w:cs="Aptos"/>
-                <w:sz w:val="22"/>
-                <w:szCs w:val="22"/>
-              </w:rPr>
-              <w:t xml:space="preserve">{{ </w:t>
-            </w:r>
-            <w:r>
-              <w:rPr>
-                <w:rFonts w:ascii="Aptos" w:eastAsia="Aptos" w:hAnsi="Aptos" w:cs="Aptos"/>
-                <w:sz w:val="22"/>
-                <w:szCs w:val="22"/>
-              </w:rPr>
-              <w:t>child</w:t>
-            </w:r>
-            <w:r>
-              <w:rPr>
-                <w:rFonts w:ascii="Aptos" w:eastAsia="Aptos" w:hAnsi="Aptos" w:cs="Aptos"/>
-                <w:sz w:val="22"/>
-                <w:szCs w:val="22"/>
-              </w:rPr>
-              <w:t>.name</w:t>
-            </w:r>
-            <w:r>
-              <w:rPr>
-                <w:rFonts w:ascii="Aptos" w:eastAsia="Aptos" w:hAnsi="Aptos" w:cs="Aptos"/>
-                <w:sz w:val="22"/>
-                <w:szCs w:val="22"/>
-              </w:rPr>
-              <w:t>.full()</w:t>
-            </w:r>
-            <w:r>
-              <w:rPr>
-                <w:rFonts w:ascii="Aptos" w:eastAsia="Aptos" w:hAnsi="Aptos" w:cs="Aptos"/>
-                <w:sz w:val="22"/>
-                <w:szCs w:val="22"/>
-              </w:rPr>
-              <w:t xml:space="preserve"> }}</w:t>
-            </w:r>
-          </w:p>
-          <w:p>
-            <w:pPr>
-              <w:pStyle w:val="NoSpacing"/>
-              <w:rPr>
-                <w:sz w:val="22"/>
-                <w:szCs w:val="22"/>
-              </w:rPr>
-            </w:pPr>
-          </w:p>
-        </w:tc>
-        <w:tc>
-          <w:tcPr>
-            <w:tcW w:w="810" w:type="dxa"/>
-            <w:gridSpan w:val="2"/>
-            <w:tcBorders>
-              <w:top w:val="single" w:sz="2" w:space="0" w:color="000000" w:themeColor="text1"/>
-              <w:left w:val="single" w:sz="2" w:space="0" w:color="000000" w:themeColor="text1"/>
-              <w:bottom w:val="single" w:sz="2" w:space="0" w:color="000000" w:themeColor="text1"/>
-              <w:right w:val="single" w:sz="2" w:space="0" w:color="000000" w:themeColor="text1"/>
-            </w:tcBorders>
-          </w:tcPr>
-          <w:p>
-            <w:pPr>
-              <w:pStyle w:val="NoSpacing"/>
-              <w:rPr>
-                <w:sz w:val="22"/>
-                <w:szCs w:val="22"/>
-              </w:rPr>
-            </w:pPr>
-            <w:r>
-              <w:rPr>
-                <w:sz w:val="22"/>
-                <w:szCs w:val="22"/>
-              </w:rPr>
-              <w:t xml:space="preserve">{{ </w:t>
-            </w:r>
-            <w:r>
-              <w:rPr>
-                <w:sz w:val="22"/>
-                <w:szCs w:val="22"/>
-              </w:rPr>
-              <w:t>child.gender</w:t>
-            </w:r>
-            <w:r>
-              <w:rPr>
-                <w:sz w:val="22"/>
-                <w:szCs w:val="22"/>
-              </w:rPr>
-              <w:t xml:space="preserve"> }}</w:t>
-            </w:r>
-          </w:p>
-        </w:tc>
-        <w:tc>
-          <w:tcPr>
-            <w:tcW w:w="1170" w:type="dxa"/>
-            <w:gridSpan w:val="5"/>
-            <w:tcBorders>
-              <w:top w:val="single" w:sz="2" w:space="0" w:color="000000" w:themeColor="text1"/>
-              <w:left w:val="single" w:sz="2" w:space="0" w:color="000000" w:themeColor="text1"/>
-              <w:bottom w:val="single" w:sz="2" w:space="0" w:color="000000" w:themeColor="text1"/>
-              <w:right w:val="single" w:sz="2" w:space="0" w:color="000000" w:themeColor="text1"/>
-            </w:tcBorders>
-          </w:tcPr>
-          <w:p>
-            <w:pPr>
-              <w:pStyle w:val="NoSpacing"/>
-              <w:rPr>
-                <w:sz w:val="22"/>
-                <w:szCs w:val="22"/>
-              </w:rPr>
-            </w:pPr>
-            <w:r>
-              <w:rPr>
-                <w:rFonts w:ascii="Aptos" w:eastAsia="Aptos" w:hAnsi="Aptos" w:cs="Aptos"/>
-                <w:sz w:val="22"/>
-                <w:szCs w:val="22"/>
-              </w:rPr>
-              <w:t xml:space="preserve">{{ </w:t>
-            </w:r>
-            <w:r>
-              <w:rPr>
-                <w:rFonts w:ascii="Aptos" w:eastAsia="Aptos" w:hAnsi="Aptos" w:cs="Aptos"/>
-                <w:sz w:val="22"/>
-                <w:szCs w:val="22"/>
-              </w:rPr>
-              <w:t>child</w:t>
-            </w:r>
-            <w:r>
-              <w:rPr>
-                <w:rFonts w:ascii="Aptos" w:eastAsia="Aptos" w:hAnsi="Aptos" w:cs="Aptos"/>
-                <w:sz w:val="22"/>
-                <w:szCs w:val="22"/>
-              </w:rPr>
-              <w:t>.ethnic }}</w:t>
-            </w:r>
-          </w:p>
-        </w:tc>
-        <w:tc>
-          <w:tcPr>
-            <w:tcW w:w="1260" w:type="dxa"/>
-            <w:gridSpan w:val="5"/>
-            <w:tcBorders>
-              <w:top w:val="single" w:sz="2" w:space="0" w:color="000000" w:themeColor="text1"/>
-              <w:left w:val="single" w:sz="2" w:space="0" w:color="000000" w:themeColor="text1"/>
-              <w:bottom w:val="single" w:sz="2" w:space="0" w:color="000000" w:themeColor="text1"/>
-              <w:right w:val="single" w:sz="2" w:space="0" w:color="000000" w:themeColor="text1"/>
-            </w:tcBorders>
-          </w:tcPr>
-          <w:p>
-            <w:pPr>
-              <w:pStyle w:val="NoSpacing"/>
-              <w:rPr>
-                <w:sz w:val="22"/>
-                <w:szCs w:val="22"/>
-              </w:rPr>
-            </w:pPr>
-            <w:r>
-              <w:rPr>
-                <w:rFonts w:ascii="Aptos" w:eastAsia="Aptos" w:hAnsi="Aptos" w:cs="Aptos"/>
-                <w:sz w:val="22"/>
-                <w:szCs w:val="22"/>
-              </w:rPr>
-              <w:t xml:space="preserve">{{ </w:t>
-            </w:r>
-            <w:r>
-              <w:rPr>
-                <w:rFonts w:ascii="Aptos" w:eastAsia="Aptos" w:hAnsi="Aptos" w:cs="Aptos"/>
-                <w:sz w:val="22"/>
-                <w:szCs w:val="22"/>
-              </w:rPr>
-              <w:t>child. age_in_years()</w:t>
-            </w:r>
-            <w:r>
-              <w:rPr>
-                <w:rFonts w:ascii="Aptos" w:eastAsia="Aptos" w:hAnsi="Aptos" w:cs="Aptos"/>
-                <w:sz w:val="22"/>
-                <w:szCs w:val="22"/>
-              </w:rPr>
-              <w:t xml:space="preserve"> }}</w:t>
-            </w:r>
-          </w:p>
-        </w:tc>
-        <w:tc>
-          <w:tcPr>
-            <w:tcW w:w="1260" w:type="dxa"/>
-            <w:gridSpan w:val="2"/>
-            <w:tcBorders>
-              <w:top w:val="single" w:sz="2" w:space="0" w:color="000000" w:themeColor="text1"/>
-              <w:left w:val="single" w:sz="2" w:space="0" w:color="000000" w:themeColor="text1"/>
-              <w:bottom w:val="single" w:sz="2" w:space="0" w:color="000000" w:themeColor="text1"/>
-              <w:right w:val="single" w:sz="2" w:space="0" w:color="000000" w:themeColor="text1"/>
-            </w:tcBorders>
-          </w:tcPr>
-          <w:p>
-            <w:pPr>
-              <w:pStyle w:val="NoSpacing"/>
-              <w:rPr>
-                <w:sz w:val="22"/>
-                <w:szCs w:val="22"/>
-              </w:rPr>
-            </w:pPr>
-            <w:r>
-              <w:rPr>
-                <w:sz w:val="22"/>
-                <w:szCs w:val="22"/>
-              </w:rPr>
-              <w:t xml:space="preserve">{{ </w:t>
-            </w:r>
-            <w:r>
-              <w:rPr>
-                <w:sz w:val="22"/>
-                <w:szCs w:val="22"/>
-              </w:rPr>
-              <w:t>child</w:t>
-            </w:r>
-            <w:r>
-              <w:rPr>
-                <w:sz w:val="22"/>
-                <w:szCs w:val="22"/>
-              </w:rPr>
-              <w:t>.reside_with }}</w:t>
-            </w:r>
-          </w:p>
-        </w:tc>
-        <w:tc>
-          <w:tcPr>
-            <w:tcW w:w="1530" w:type="dxa"/>
-            <w:gridSpan w:val="3"/>
-            <w:tcBorders>
-              <w:top w:val="single" w:sz="2" w:space="0" w:color="000000" w:themeColor="text1"/>
-              <w:left w:val="single" w:sz="2" w:space="0" w:color="000000" w:themeColor="text1"/>
-              <w:bottom w:val="single" w:sz="2" w:space="0" w:color="000000" w:themeColor="text1"/>
-              <w:right w:val="single" w:sz="2" w:space="0" w:color="000000" w:themeColor="text1"/>
-            </w:tcBorders>
-          </w:tcPr>
-          <w:p>
-            <w:pPr>
-              <w:pStyle w:val="NoSpacing"/>
-              <w:rPr>
-                <w:sz w:val="22"/>
-                <w:szCs w:val="22"/>
-              </w:rPr>
-            </w:pPr>
-            <w:r>
-              <w:rPr>
-                <w:sz w:val="22"/>
-                <w:szCs w:val="22"/>
-              </w:rPr>
-              <w:t xml:space="preserve">{{ </w:t>
-            </w:r>
-            <w:r>
-              <w:rPr>
-                <w:sz w:val="22"/>
-                <w:szCs w:val="22"/>
-              </w:rPr>
-              <w:t>child</w:t>
-            </w:r>
-            <w:r>
-              <w:rPr>
-                <w:sz w:val="22"/>
-                <w:szCs w:val="22"/>
-              </w:rPr>
-              <w:t>.protected_relationship }}</w:t>
-            </w:r>
-          </w:p>
-        </w:tc>
-        <w:tc>
-          <w:tcPr>
-            <w:tcW w:w="1980" w:type="dxa"/>
-            <w:gridSpan w:val="2"/>
-            <w:tcBorders>
-              <w:top w:val="single" w:sz="2" w:space="0" w:color="000000" w:themeColor="text1"/>
-              <w:left w:val="single" w:sz="2" w:space="0" w:color="000000" w:themeColor="text1"/>
-              <w:bottom w:val="single" w:sz="2" w:space="0" w:color="000000" w:themeColor="text1"/>
-              <w:right w:val="single" w:sz="2" w:space="0" w:color="000000" w:themeColor="text1"/>
-            </w:tcBorders>
-          </w:tcPr>
-          <w:p>
-            <w:pPr>
-              <w:pStyle w:val="NoSpacing"/>
-              <w:rPr>
-                <w:sz w:val="22"/>
-                <w:szCs w:val="22"/>
-              </w:rPr>
-            </w:pPr>
-            <w:r>
-              <w:rPr>
-                <w:sz w:val="22"/>
-                <w:szCs w:val="22"/>
-              </w:rPr>
-              <w:t xml:space="preserve">{{ </w:t>
-            </w:r>
-            <w:r>
-              <w:rPr>
-                <w:sz w:val="22"/>
-                <w:szCs w:val="22"/>
-              </w:rPr>
-              <w:t>child</w:t>
-            </w:r>
-            <w:r>
-              <w:rPr>
-                <w:sz w:val="22"/>
-                <w:szCs w:val="22"/>
-              </w:rPr>
-              <w:t>.restrained_relationship }}</w:t>
-            </w:r>
-          </w:p>
-        </w:tc>
-      </w:tr>
-      <w:tr>
-        <w:trPr>
-          <w:trHeight w:val="300"/>
-        </w:trPr>
-        <w:tc>
-          <w:tcPr>
-            <w:tcW w:w="2790" w:type="dxa"/>
-            <w:gridSpan w:val="3"/>
-            <w:tcBorders>
-              <w:top w:val="single" w:sz="2" w:space="0" w:color="000000" w:themeColor="text1"/>
-              <w:left w:val="single" w:sz="2" w:space="0" w:color="000000" w:themeColor="text1"/>
-              <w:bottom w:val="single" w:sz="2" w:space="0" w:color="000000" w:themeColor="text1"/>
-              <w:right w:val="single" w:sz="2" w:space="0" w:color="000000" w:themeColor="text1"/>
-            </w:tcBorders>
-          </w:tcPr>
-          <w:p>
-            <w:pPr>
-              <w:rPr>
-                <w:rFonts w:ascii="Aptos" w:eastAsia="Aptos" w:hAnsi="Aptos" w:cs="Aptos"/>
-                <w:sz w:val="22"/>
-                <w:szCs w:val="22"/>
-              </w:rPr>
-            </w:pPr>
-            <w:r>
-              <w:rPr>
-                <w:rFonts w:ascii="Aptos" w:eastAsia="Aptos" w:hAnsi="Aptos" w:cs="Aptos"/>
-                <w:sz w:val="22"/>
-                <w:szCs w:val="22"/>
-              </w:rPr>
-              <w:t>{%tr endfor %}</w:t>
-            </w:r>
-          </w:p>
-        </w:tc>
-        <w:tc>
-          <w:tcPr>
-            <w:tcW w:w="810" w:type="dxa"/>
-            <w:gridSpan w:val="2"/>
-            <w:tcBorders>
-              <w:top w:val="single" w:sz="2" w:space="0" w:color="000000" w:themeColor="text1"/>
-              <w:left w:val="single" w:sz="2" w:space="0" w:color="000000" w:themeColor="text1"/>
-              <w:bottom w:val="single" w:sz="2" w:space="0" w:color="000000" w:themeColor="text1"/>
-              <w:right w:val="single" w:sz="2" w:space="0" w:color="000000" w:themeColor="text1"/>
-            </w:tcBorders>
-          </w:tcPr>
-          <w:p>
-            <w:pPr>
-              <w:pStyle w:val="NoSpacing"/>
-              <w:rPr>
-                <w:sz w:val="22"/>
-                <w:szCs w:val="22"/>
-              </w:rPr>
-            </w:pPr>
-          </w:p>
-        </w:tc>
-        <w:tc>
-          <w:tcPr>
-            <w:tcW w:w="1170" w:type="dxa"/>
-            <w:gridSpan w:val="5"/>
-            <w:tcBorders>
-              <w:top w:val="single" w:sz="2" w:space="0" w:color="000000" w:themeColor="text1"/>
-              <w:left w:val="single" w:sz="2" w:space="0" w:color="000000" w:themeColor="text1"/>
-              <w:bottom w:val="single" w:sz="2" w:space="0" w:color="000000" w:themeColor="text1"/>
-              <w:right w:val="single" w:sz="2" w:space="0" w:color="000000" w:themeColor="text1"/>
-            </w:tcBorders>
-          </w:tcPr>
-          <w:p>
-            <w:pPr>
-              <w:pStyle w:val="NoSpacing"/>
-              <w:rPr>
-                <w:rFonts w:ascii="Aptos" w:eastAsia="Aptos" w:hAnsi="Aptos" w:cs="Aptos"/>
-                <w:sz w:val="22"/>
-                <w:szCs w:val="22"/>
-              </w:rPr>
-            </w:pPr>
-          </w:p>
-        </w:tc>
-        <w:tc>
-          <w:tcPr>
-            <w:tcW w:w="1260" w:type="dxa"/>
-            <w:gridSpan w:val="5"/>
-            <w:tcBorders>
-              <w:top w:val="single" w:sz="2" w:space="0" w:color="000000" w:themeColor="text1"/>
-              <w:left w:val="single" w:sz="2" w:space="0" w:color="000000" w:themeColor="text1"/>
-              <w:bottom w:val="single" w:sz="2" w:space="0" w:color="000000" w:themeColor="text1"/>
-              <w:right w:val="single" w:sz="2" w:space="0" w:color="000000" w:themeColor="text1"/>
-            </w:tcBorders>
-          </w:tcPr>
-          <w:p>
-            <w:pPr>
-              <w:pStyle w:val="NoSpacing"/>
-              <w:rPr>
-                <w:rFonts w:ascii="Aptos" w:eastAsia="Aptos" w:hAnsi="Aptos" w:cs="Aptos"/>
-                <w:sz w:val="22"/>
-                <w:szCs w:val="22"/>
-              </w:rPr>
-            </w:pPr>
-          </w:p>
-        </w:tc>
-        <w:tc>
-          <w:tcPr>
-            <w:tcW w:w="1260" w:type="dxa"/>
-            <w:gridSpan w:val="2"/>
-            <w:tcBorders>
-              <w:top w:val="single" w:sz="2" w:space="0" w:color="000000" w:themeColor="text1"/>
-              <w:left w:val="single" w:sz="2" w:space="0" w:color="000000" w:themeColor="text1"/>
-              <w:bottom w:val="single" w:sz="2" w:space="0" w:color="000000" w:themeColor="text1"/>
-              <w:right w:val="single" w:sz="2" w:space="0" w:color="000000" w:themeColor="text1"/>
-            </w:tcBorders>
-          </w:tcPr>
-          <w:p>
-            <w:pPr>
-              <w:pStyle w:val="NoSpacing"/>
-              <w:rPr>
-                <w:sz w:val="22"/>
-                <w:szCs w:val="22"/>
-              </w:rPr>
-            </w:pPr>
-          </w:p>
-        </w:tc>
-        <w:tc>
-          <w:tcPr>
-            <w:tcW w:w="1530" w:type="dxa"/>
-            <w:gridSpan w:val="3"/>
-            <w:tcBorders>
-              <w:top w:val="single" w:sz="2" w:space="0" w:color="000000" w:themeColor="text1"/>
-              <w:left w:val="single" w:sz="2" w:space="0" w:color="000000" w:themeColor="text1"/>
-              <w:bottom w:val="single" w:sz="2" w:space="0" w:color="000000" w:themeColor="text1"/>
-              <w:right w:val="single" w:sz="2" w:space="0" w:color="000000" w:themeColor="text1"/>
-            </w:tcBorders>
-          </w:tcPr>
-          <w:p>
-            <w:pPr>
-              <w:pStyle w:val="NoSpacing"/>
-              <w:rPr>
-                <w:sz w:val="22"/>
-                <w:szCs w:val="22"/>
-              </w:rPr>
-            </w:pPr>
-          </w:p>
-        </w:tc>
-        <w:tc>
-          <w:tcPr>
-            <w:tcW w:w="1980" w:type="dxa"/>
-            <w:gridSpan w:val="2"/>
-            <w:tcBorders>
-              <w:top w:val="single" w:sz="2" w:space="0" w:color="000000" w:themeColor="text1"/>
-              <w:left w:val="single" w:sz="2" w:space="0" w:color="000000" w:themeColor="text1"/>
-              <w:bottom w:val="single" w:sz="2" w:space="0" w:color="000000" w:themeColor="text1"/>
-              <w:right w:val="single" w:sz="2" w:space="0" w:color="000000" w:themeColor="text1"/>
-            </w:tcBorders>
-          </w:tcPr>
-          <w:p>
-            <w:pPr>
-              <w:pStyle w:val="NoSpacing"/>
-              <w:rPr>
-                <w:sz w:val="22"/>
-                <w:szCs w:val="22"/>
-              </w:rPr>
-            </w:pPr>
-          </w:p>
-        </w:tc>
-      </w:tr>
-      <w:tr>
-        <w:trPr>
-          <w:trHeight w:val="300"/>
-        </w:trPr>
-        <w:tc>
-          <w:tcPr>
-            <w:tcW w:w="10800" w:type="dxa"/>
-            <w:gridSpan w:val="22"/>
-            <w:tcBorders>
-              <w:top w:val="single" w:sz="18" w:space="0" w:color="000000" w:themeColor="text1"/>
-              <w:left w:val="single" w:sz="2" w:space="0" w:color="000000" w:themeColor="text1"/>
-              <w:bottom w:val="single" w:sz="2" w:space="0" w:color="000000" w:themeColor="text1"/>
-              <w:right w:val="single" w:sz="2" w:space="0" w:color="000000" w:themeColor="text1"/>
-            </w:tcBorders>
-          </w:tcPr>
-          <w:p>
-            <w:pPr>
-              <w:pStyle w:val="NoSpacing"/>
-              <w:rPr>
-                <w:b/>
-                <w:bCs/>
-              </w:rPr>
-            </w:pPr>
-            <w:r>
-              <w:rPr>
-                <w:b/>
-                <w:bCs/>
-              </w:rPr>
-              <w:t>Victim’s Household Members or Adult Children Protected</w:t>
-            </w:r>
-          </w:p>
-        </w:tc>
-      </w:tr>
-      <w:tr>
-        <w:trPr>
-          <w:trHeight w:val="300"/>
-        </w:trPr>
-        <w:tc>
-          <w:tcPr>
-            <w:tcW w:w="5220" w:type="dxa"/>
-            <w:gridSpan w:val="12"/>
-            <w:tcBorders>
-              <w:top w:val="single" w:sz="2" w:space="0" w:color="000000" w:themeColor="text1"/>
-              <w:left w:val="single" w:sz="2" w:space="0" w:color="000000" w:themeColor="text1"/>
-              <w:bottom w:val="single" w:sz="2" w:space="0" w:color="000000" w:themeColor="text1"/>
-              <w:right w:val="single" w:sz="2" w:space="0" w:color="000000" w:themeColor="text1"/>
-            </w:tcBorders>
-          </w:tcPr>
-          <w:p>
-            <w:pPr>
-              <w:pStyle w:val="NoSpacing"/>
-            </w:pPr>
-            <w:r>
-              <w:t>{{ household</w:t>
-            </w:r>
-            <w:r>
-              <w:t>[0]</w:t>
-            </w:r>
-            <w:r>
-              <w:t>.name }}</w:t>
-            </w:r>
-          </w:p>
-        </w:tc>
-        <w:tc>
-          <w:tcPr>
-            <w:tcW w:w="5580" w:type="dxa"/>
-            <w:gridSpan w:val="10"/>
-            <w:tcBorders>
-              <w:top w:val="single" w:sz="2" w:space="0" w:color="000000" w:themeColor="text1"/>
-              <w:left w:val="single" w:sz="2" w:space="0" w:color="000000" w:themeColor="text1"/>
-              <w:bottom w:val="single" w:sz="2" w:space="0" w:color="000000" w:themeColor="text1"/>
-              <w:right w:val="single" w:sz="2" w:space="0" w:color="000000" w:themeColor="text1"/>
-            </w:tcBorders>
-          </w:tcPr>
-          <w:p>
-            <w:pPr>
-              <w:pStyle w:val="NoSpacing"/>
             </w:pPr>
           </w:p>
         </w:tc>

</xml_diff>

<commit_message>
Fixed errors, bugs remaining, but mostly functional for demo
</commit_message>
<xml_diff>
--- a/docassemble/MwtPetitionForHarassmentProtect/data/templates/mwt_petition_for_harassment_protect.docx
+++ b/docassemble/MwtPetitionForHarassmentProtect/data/templates/mwt_petition_for_harassment_protect.docx
@@ -1045,6 +1045,14 @@
           <w:b/>
           <w:bCs/>
         </w:rPr>
+        <w:t xml:space="preserve">Option 1: </w:t>
+      </w:r>
+      <w:r>
+        <w:rPr>
+          <w:rFonts w:ascii="Aptos" w:hAnsi="Aptos" w:eastAsia="Aptos" w:cs="Aptos"/>
+          <w:b/>
+          <w:bCs/>
+        </w:rPr>
         <w:t>Electronically sign and date</w:t>
       </w:r>
       <w:r>
@@ -1055,13 +1063,51 @@
       </w:r>
     </w:p>
     <w:p>
+      <w:pPr>
+        <w:pStyle w:val="ListParagraph"/>
+        <w:numPr>
+          <w:ilvl w:val="0"/>
+          <w:numId w:val="5"/>
+        </w:numPr>
+        <w:rPr>
+          <w:rFonts w:ascii="Aptos" w:hAnsi="Aptos" w:eastAsia="Aptos" w:cs="Aptos"/>
+        </w:rPr>
+      </w:pPr>
       <w:r>
         <w:rPr>
           <w:rFonts w:ascii="Aptos" w:hAnsi="Aptos" w:eastAsia="Aptos" w:cs="Aptos"/>
           <w:b/>
           <w:bCs/>
         </w:rPr>
+        <w:t>Option 2:</w:t>
+      </w:r>
+      <w:r>
+        <w:rPr>
+          <w:rFonts w:ascii="Aptos" w:hAnsi="Aptos" w:eastAsia="Aptos" w:cs="Aptos"/>
+        </w:rPr>
         <w:t xml:space="preserve"> </w:t>
+      </w:r>
+      <w:r>
+        <w:rPr>
+          <w:rFonts w:ascii="Aptos" w:hAnsi="Aptos" w:eastAsia="Aptos" w:cs="Aptos"/>
+          <w:b/>
+          <w:bCs/>
+        </w:rPr>
+        <w:t>P</w:t>
+      </w:r>
+      <w:r>
+        <w:rPr>
+          <w:rFonts w:ascii="Aptos" w:hAnsi="Aptos" w:eastAsia="Aptos" w:cs="Aptos"/>
+          <w:b/>
+          <w:bCs/>
+        </w:rPr>
+        <w:t>rint, sign and date</w:t>
+      </w:r>
+      <w:r>
+        <w:rPr>
+          <w:rFonts w:ascii="Aptos" w:hAnsi="Aptos" w:eastAsia="Aptos" w:cs="Aptos"/>
+        </w:rPr>
+        <w:t xml:space="preserve"> the form. By signing, you confirm that everything you wrote is true and accurate to the best of your knowledge.</w:t>
       </w:r>
     </w:p>
     <w:p>
@@ -1071,12 +1117,34 @@
           <w:b/>
           <w:bCs/>
         </w:rPr>
-        <w:t xml:space="preserve">Confidentiality and Sealing of Records </w:t>
+        <w:t xml:space="preserve"> </w:t>
       </w:r>
     </w:p>
     <w:p>
       <w:r>
-        <w:t>If you believe that sharing your residential address could put your health, safety, or liberty at risk, you may ask to have that information sealed and provide a different mailing address instead. The court will still require your residential address in order to process your case.</w:t>
+        <w:rPr>
+          <w:rFonts w:ascii="Aptos" w:hAnsi="Aptos" w:eastAsia="Aptos" w:cs="Aptos"/>
+          <w:b/>
+          <w:bCs/>
+        </w:rPr>
+        <w:t xml:space="preserve">Confidentiality and Sealing of Records </w:t>
+      </w:r>
+    </w:p>
+    <w:p>
+      <w:r>
+        <w:t xml:space="preserve">If you believe that sharing your residential address could put your health, safety, or liberty at risk, you may ask to have that information sealed and provide a </w:t>
+      </w:r>
+      <w:r>
+        <w:t>Confidential Contact name, phone number, and address</w:t>
+      </w:r>
+      <w:r>
+        <w:t xml:space="preserve">. The </w:t>
+      </w:r>
+      <w:r>
+        <w:t>Tribal Court</w:t>
+      </w:r>
+      <w:r>
+        <w:t xml:space="preserve"> will still require your residential address in order to process your case.</w:t>
       </w:r>
     </w:p>
     <w:p>
@@ -2894,7 +2962,6 @@
           <w:tcPr>
             <w:tcW w:w="10800" w:type="dxa"/>
             <w:gridSpan w:val="2"/>
-            <w:tcMar/>
           </w:tcPr>
           <w:p>
             <w:pPr>
@@ -2915,7 +2982,6 @@
           <w:tcPr>
             <w:tcW w:w="10800" w:type="dxa"/>
             <w:gridSpan w:val="2"/>
-            <w:tcMar/>
           </w:tcPr>
           <w:p>
             <w:pPr>
@@ -2943,7 +3009,6 @@
         <w:tc>
           <w:tcPr>
             <w:tcW w:w="1800" w:type="dxa"/>
-            <w:tcMar/>
           </w:tcPr>
           <w:p>
             <w:pPr>
@@ -2954,7 +3019,6 @@
         <w:tc>
           <w:tcPr>
             <w:tcW w:w="9000" w:type="dxa"/>
-            <w:tcMar/>
           </w:tcPr>
           <w:p>
             <w:pPr>
@@ -2978,12 +3042,7 @@
           </w:p>
           <w:p>
             <w:pPr>
-              <w:pStyle w:val="Normal"/>
-              <w:suppressLineNumbers w:val="0"/>
-              <w:bidi w:val="0"/>
-              <w:spacing w:before="0" w:beforeAutospacing="off" w:after="0" w:afterAutospacing="off" w:line="259" w:lineRule="auto"/>
-              <w:ind w:left="0" w:right="0"/>
-              <w:jc w:val="left"/>
+              <w:spacing w:line="259" w:lineRule="auto"/>
             </w:pPr>
             <w:r>
               <w:rPr>
@@ -2992,11 +3051,9 @@
               <w:t xml:space="preserve"> </w:t>
             </w:r>
             <w:r>
-              <w:rPr/>
               <w:t>Me</w:t>
             </w:r>
             <w:r>
-              <w:rPr/>
               <w:t xml:space="preserve"> </w:t>
             </w:r>
             <w:r>
@@ -3007,6 +3064,7 @@
               </w:rPr>
               <w:t xml:space="preserve">{{ </w:t>
             </w:r>
+            <w:proofErr w:type="spellStart"/>
             <w:r>
               <w:rPr>
                 <w:rFonts w:ascii="Aptos" w:hAnsi="Aptos" w:eastAsia="Aptos" w:cs="Aptos"/>
@@ -3015,6 +3073,7 @@
               </w:rPr>
               <w:t>output_checkbox</w:t>
             </w:r>
+            <w:proofErr w:type="spellEnd"/>
             <w:r>
               <w:rPr>
                 <w:rFonts w:ascii="Aptos" w:hAnsi="Aptos" w:eastAsia="Aptos" w:cs="Aptos"/>
@@ -3023,6 +3082,7 @@
               </w:rPr>
               <w:t>(</w:t>
             </w:r>
+            <w:proofErr w:type="spellStart"/>
             <w:r>
               <w:rPr>
                 <w:rFonts w:ascii="Aptos" w:hAnsi="Aptos" w:eastAsia="Aptos" w:cs="Aptos"/>
@@ -3037,16 +3097,9 @@
                 <w:sz w:val="22"/>
                 <w:szCs w:val="22"/>
               </w:rPr>
-              <w:t>restrained_from</w:t>
-            </w:r>
-            <w:r>
-              <w:rPr>
-                <w:rFonts w:ascii="Aptos" w:hAnsi="Aptos" w:eastAsia="Aptos" w:cs="Aptos"/>
-                <w:sz w:val="22"/>
-                <w:szCs w:val="22"/>
-              </w:rPr>
-              <w:t>_online</w:t>
-            </w:r>
+              <w:t>restrained_from_online</w:t>
+            </w:r>
+            <w:proofErr w:type="spellEnd"/>
             <w:r>
               <w:rPr>
                 <w:rFonts w:ascii="Aptos" w:hAnsi="Aptos" w:eastAsia="Aptos" w:cs="Aptos"/>
@@ -3061,15 +3114,7 @@
                 <w:sz w:val="22"/>
                 <w:szCs w:val="22"/>
               </w:rPr>
-              <w:t xml:space="preserve"> }</w:t>
-            </w:r>
-            <w:r>
-              <w:rPr>
-                <w:rFonts w:ascii="Aptos" w:hAnsi="Aptos" w:eastAsia="Aptos" w:cs="Aptos"/>
-                <w:sz w:val="22"/>
-                <w:szCs w:val="22"/>
-              </w:rPr>
-              <w:t>}</w:t>
+              <w:t xml:space="preserve"> }}</w:t>
             </w:r>
           </w:p>
           <w:p>
@@ -3086,7 +3131,6 @@
         <w:tc>
           <w:tcPr>
             <w:tcW w:w="1800" w:type="dxa"/>
-            <w:tcMar/>
           </w:tcPr>
           <w:p>
             <w:pPr>
@@ -3097,7 +3141,6 @@
         <w:tc>
           <w:tcPr>
             <w:tcW w:w="9000" w:type="dxa"/>
-            <w:tcMar/>
           </w:tcPr>
           <w:p>
             <w:pPr>
@@ -3110,11 +3153,7 @@
           <w:p>
             <w:pPr>
               <w:pStyle w:val="NoSpacing"/>
-              <w:suppressLineNumbers w:val="0"/>
-              <w:bidi w:val="0"/>
-              <w:spacing w:before="0" w:beforeAutospacing="off" w:after="0" w:afterAutospacing="off" w:line="259" w:lineRule="auto"/>
-              <w:ind w:left="0" w:right="0"/>
-              <w:jc w:val="left"/>
+              <w:spacing w:line="259" w:lineRule="auto"/>
             </w:pPr>
             <w:r>
               <w:rPr>
@@ -3123,11 +3162,9 @@
               <w:t xml:space="preserve"> </w:t>
             </w:r>
             <w:r>
-              <w:rPr/>
               <w:t>Me</w:t>
             </w:r>
             <w:r>
-              <w:rPr/>
               <w:t xml:space="preserve"> </w:t>
             </w:r>
             <w:r>
@@ -3138,6 +3175,7 @@
               </w:rPr>
               <w:t xml:space="preserve">{{ </w:t>
             </w:r>
+            <w:proofErr w:type="spellStart"/>
             <w:r>
               <w:rPr>
                 <w:rFonts w:ascii="Aptos" w:hAnsi="Aptos" w:eastAsia="Aptos" w:cs="Aptos"/>
@@ -3146,6 +3184,7 @@
               </w:rPr>
               <w:t>output_checkbox</w:t>
             </w:r>
+            <w:proofErr w:type="spellEnd"/>
             <w:r>
               <w:rPr>
                 <w:rFonts w:ascii="Aptos" w:hAnsi="Aptos" w:eastAsia="Aptos" w:cs="Aptos"/>
@@ -3154,6 +3193,7 @@
               </w:rPr>
               <w:t>(</w:t>
             </w:r>
+            <w:proofErr w:type="spellStart"/>
             <w:r>
               <w:rPr>
                 <w:rFonts w:ascii="Aptos" w:hAnsi="Aptos" w:eastAsia="Aptos" w:cs="Aptos"/>
@@ -3168,16 +3208,9 @@
                 <w:sz w:val="22"/>
                 <w:szCs w:val="22"/>
               </w:rPr>
-              <w:t>restrained_from</w:t>
-            </w:r>
-            <w:r>
-              <w:rPr>
-                <w:rFonts w:ascii="Aptos" w:hAnsi="Aptos" w:eastAsia="Aptos" w:cs="Aptos"/>
-                <w:sz w:val="22"/>
-                <w:szCs w:val="22"/>
-              </w:rPr>
-              <w:t>_any_contact</w:t>
-            </w:r>
+              <w:t>restrained_from_any_contact</w:t>
+            </w:r>
+            <w:proofErr w:type="spellEnd"/>
             <w:r>
               <w:rPr>
                 <w:rFonts w:ascii="Aptos" w:hAnsi="Aptos" w:eastAsia="Aptos" w:cs="Aptos"/>
@@ -3192,15 +3225,7 @@
                 <w:sz w:val="22"/>
                 <w:szCs w:val="22"/>
               </w:rPr>
-              <w:t>}</w:t>
-            </w:r>
-            <w:r>
-              <w:rPr>
-                <w:rFonts w:ascii="Aptos" w:hAnsi="Aptos" w:eastAsia="Aptos" w:cs="Aptos"/>
-                <w:sz w:val="22"/>
-                <w:szCs w:val="22"/>
-              </w:rPr>
-              <w:t>}</w:t>
+              <w:t>}}</w:t>
             </w:r>
           </w:p>
           <w:p>
@@ -3217,7 +3242,6 @@
         <w:tc>
           <w:tcPr>
             <w:tcW w:w="1800" w:type="dxa"/>
-            <w:tcMar/>
           </w:tcPr>
           <w:p>
             <w:pPr>
@@ -3228,7 +3252,6 @@
         <w:tc>
           <w:tcPr>
             <w:tcW w:w="9000" w:type="dxa"/>
-            <w:tcMar/>
           </w:tcPr>
           <w:p>
             <w:pPr>
@@ -3252,7 +3275,6 @@
         <w:tc>
           <w:tcPr>
             <w:tcW w:w="1800" w:type="dxa"/>
-            <w:tcMar/>
           </w:tcPr>
           <w:p>
             <w:pPr>
@@ -3263,7 +3285,6 @@
         <w:tc>
           <w:tcPr>
             <w:tcW w:w="9000" w:type="dxa"/>
-            <w:tcMar/>
           </w:tcPr>
           <w:p>
             <w:pPr>
@@ -3513,7 +3534,6 @@
         <w:tc>
           <w:tcPr>
             <w:tcW w:w="1800" w:type="dxa"/>
-            <w:tcMar/>
           </w:tcPr>
           <w:p>
             <w:pPr>
@@ -3524,7 +3544,6 @@
         <w:tc>
           <w:tcPr>
             <w:tcW w:w="9000" w:type="dxa"/>
-            <w:tcMar/>
           </w:tcPr>
           <w:p>
             <w:pPr>
@@ -3551,7 +3570,6 @@
         <w:tc>
           <w:tcPr>
             <w:tcW w:w="1800" w:type="dxa"/>
-            <w:tcMar/>
           </w:tcPr>
           <w:p>
             <w:pPr>
@@ -3562,7 +3580,6 @@
         <w:tc>
           <w:tcPr>
             <w:tcW w:w="9000" w:type="dxa"/>
-            <w:tcMar/>
           </w:tcPr>
           <w:p>
             <w:pPr>
@@ -3586,7 +3603,6 @@
         <w:tc>
           <w:tcPr>
             <w:tcW w:w="1800" w:type="dxa"/>
-            <w:tcMar/>
           </w:tcPr>
           <w:p>
             <w:pPr>
@@ -3597,7 +3613,6 @@
         <w:tc>
           <w:tcPr>
             <w:tcW w:w="9000" w:type="dxa"/>
-            <w:tcMar/>
           </w:tcPr>
           <w:p>
             <w:pPr>
@@ -3621,7 +3636,6 @@
         <w:tc>
           <w:tcPr>
             <w:tcW w:w="1800" w:type="dxa"/>
-            <w:tcMar/>
           </w:tcPr>
           <w:p>
             <w:pPr>
@@ -3632,7 +3646,6 @@
         <w:tc>
           <w:tcPr>
             <w:tcW w:w="9000" w:type="dxa"/>
-            <w:tcMar/>
           </w:tcPr>
           <w:p>
             <w:pPr>
@@ -3982,12 +3995,7 @@
     </w:p>
     <w:p>
       <w:pPr>
-        <w:pStyle w:val="Normal"/>
-        <w:suppressLineNumbers w:val="0"/>
-        <w:bidi w:val="0"/>
-        <w:spacing w:before="0" w:beforeAutospacing="off" w:after="0" w:afterAutospacing="off" w:line="259" w:lineRule="auto"/>
-        <w:ind w:left="0" w:right="0"/>
-        <w:jc w:val="left"/>
+        <w:spacing w:line="259" w:lineRule="auto"/>
         <w:rPr>
           <w:rFonts w:ascii="Aptos" w:hAnsi="Aptos" w:eastAsia="Aptos" w:cs="Aptos"/>
           <w:sz w:val="22"/>
@@ -4026,7 +4034,7 @@
           <w:sz w:val="22"/>
           <w:szCs w:val="22"/>
         </w:rPr>
-        <w:t>:  {</w:t>
+        <w:t>:</w:t>
       </w:r>
       <w:r>
         <w:rPr>
@@ -4034,7 +4042,7 @@
           <w:sz w:val="22"/>
           <w:szCs w:val="22"/>
         </w:rPr>
-        <w:t xml:space="preserve">{  </w:t>
+        <w:t xml:space="preserve">  {{  </w:t>
       </w:r>
       <w:r>
         <w:rPr>
@@ -4050,7 +4058,7 @@
           <w:sz w:val="22"/>
           <w:szCs w:val="22"/>
         </w:rPr>
-        <w:t>s</w:t>
+        <w:t>s[0].</w:t>
       </w:r>
       <w:r>
         <w:rPr>
@@ -4058,7 +4066,7 @@
           <w:sz w:val="22"/>
           <w:szCs w:val="22"/>
         </w:rPr>
-        <w:t>[0].</w:t>
+        <w:t>address</w:t>
       </w:r>
       <w:r>
         <w:rPr>
@@ -4066,7 +4074,7 @@
           <w:sz w:val="22"/>
           <w:szCs w:val="22"/>
         </w:rPr>
-        <w:t>address</w:t>
+        <w:t>.block()</w:t>
       </w:r>
       <w:r>
         <w:rPr>
@@ -4074,39 +4082,7 @@
           <w:sz w:val="22"/>
           <w:szCs w:val="22"/>
         </w:rPr>
-        <w:t>.block</w:t>
-      </w:r>
-      <w:r>
-        <w:rPr>
-          <w:rFonts w:ascii="Aptos" w:hAnsi="Aptos" w:eastAsia="Aptos" w:cs="Aptos"/>
-          <w:sz w:val="22"/>
-          <w:szCs w:val="22"/>
-        </w:rPr>
-        <w:t>(</w:t>
-      </w:r>
-      <w:r>
-        <w:rPr>
-          <w:rFonts w:ascii="Aptos" w:hAnsi="Aptos" w:eastAsia="Aptos" w:cs="Aptos"/>
-          <w:sz w:val="22"/>
-          <w:szCs w:val="22"/>
-        </w:rPr>
-        <w:t>)</w:t>
-      </w:r>
-      <w:r>
-        <w:rPr>
-          <w:rFonts w:ascii="Aptos" w:hAnsi="Aptos" w:eastAsia="Aptos" w:cs="Aptos"/>
-          <w:sz w:val="22"/>
-          <w:szCs w:val="22"/>
-        </w:rPr>
-        <w:t xml:space="preserve">  }</w:t>
-      </w:r>
-      <w:r>
-        <w:rPr>
-          <w:rFonts w:ascii="Aptos" w:hAnsi="Aptos" w:eastAsia="Aptos" w:cs="Aptos"/>
-          <w:sz w:val="22"/>
-          <w:szCs w:val="22"/>
-        </w:rPr>
-        <w:t>}</w:t>
+        <w:t xml:space="preserve">  }}</w:t>
       </w:r>
     </w:p>
     <w:p>
@@ -5650,6 +5626,7 @@
             <w:pPr>
               <w:pStyle w:val="NoSpacing"/>
               <w:rPr>
+                <w:rFonts w:ascii="Aptos" w:hAnsi="Aptos" w:eastAsia="Aptos" w:cs="Aptos"/>
                 <w:sz w:val="22"/>
                 <w:szCs w:val="22"/>
               </w:rPr>
@@ -5690,8 +5667,155 @@
                 <w:sz w:val="22"/>
                 <w:szCs w:val="22"/>
               </w:rPr>
-              <w:t>output_checkbox(is_defendant_need_interpreter</w:t>
-            </w:r>
+              <w:t>output_checkbox</w:t>
+            </w:r>
+            <w:r>
+              <w:rPr>
+                <w:rFonts w:ascii="Aptos" w:hAnsi="Aptos" w:eastAsia="Aptos" w:cs="Aptos"/>
+                <w:sz w:val="22"/>
+                <w:szCs w:val="22"/>
+              </w:rPr>
+              <w:t>(</w:t>
+            </w:r>
+            <w:r>
+              <w:rPr>
+                <w:rFonts w:ascii="Aptos" w:hAnsi="Aptos" w:eastAsia="Aptos" w:cs="Aptos"/>
+                <w:sz w:val="22"/>
+                <w:szCs w:val="22"/>
+              </w:rPr>
+              <w:t>is_</w:t>
+            </w:r>
+            <w:r>
+              <w:rPr>
+                <w:rFonts w:ascii="Aptos" w:hAnsi="Aptos" w:eastAsia="Aptos" w:cs="Aptos"/>
+                <w:sz w:val="22"/>
+                <w:szCs w:val="22"/>
+              </w:rPr>
+              <w:t>defendant_need_interprete</w:t>
+            </w:r>
+            <w:r>
+              <w:rPr>
+                <w:rFonts w:ascii="Aptos" w:hAnsi="Aptos" w:eastAsia="Aptos" w:cs="Aptos"/>
+                <w:sz w:val="22"/>
+                <w:szCs w:val="22"/>
+              </w:rPr>
+              <w:t>r</w:t>
+            </w:r>
+            <w:r>
+              <w:rPr>
+                <w:rFonts w:ascii="Aptos" w:hAnsi="Aptos" w:eastAsia="Aptos" w:cs="Aptos"/>
+                <w:sz w:val="22"/>
+                <w:szCs w:val="22"/>
+              </w:rPr>
+              <w:t>) }</w:t>
+            </w:r>
+            <w:r>
+              <w:rPr>
+                <w:rFonts w:ascii="Aptos" w:hAnsi="Aptos" w:eastAsia="Aptos" w:cs="Aptos"/>
+                <w:sz w:val="22"/>
+                <w:szCs w:val="22"/>
+              </w:rPr>
+              <w:t xml:space="preserve">} </w:t>
+            </w:r>
+          </w:p>
+          <w:p>
+            <w:pPr>
+              <w:pStyle w:val="NoSpacing"/>
+              <w:rPr>
+                <w:sz w:val="22"/>
+                <w:szCs w:val="22"/>
+              </w:rPr>
+            </w:pPr>
+            <w:r>
+              <w:rPr>
+                <w:sz w:val="22"/>
+                <w:szCs w:val="22"/>
+              </w:rPr>
+              <w:t>No</w:t>
+            </w:r>
+            <w:r>
+              <w:rPr>
+                <w:sz w:val="22"/>
+                <w:szCs w:val="22"/>
+              </w:rPr>
+              <w:t xml:space="preserve"> </w:t>
+            </w:r>
+            <w:r>
+              <w:rPr>
+                <w:rFonts w:ascii="Aptos" w:hAnsi="Aptos" w:eastAsia="Aptos" w:cs="Aptos"/>
+                <w:sz w:val="22"/>
+                <w:szCs w:val="22"/>
+              </w:rPr>
+              <w:t>{</w:t>
+            </w:r>
+            <w:r>
+              <w:rPr>
+                <w:rFonts w:ascii="Aptos" w:hAnsi="Aptos" w:eastAsia="Aptos" w:cs="Aptos"/>
+                <w:sz w:val="22"/>
+                <w:szCs w:val="22"/>
+              </w:rPr>
+              <w:t xml:space="preserve">{ </w:t>
+            </w:r>
+            <w:proofErr w:type="spellStart"/>
+            <w:r>
+              <w:rPr>
+                <w:rFonts w:ascii="Aptos" w:hAnsi="Aptos" w:eastAsia="Aptos" w:cs="Aptos"/>
+                <w:sz w:val="22"/>
+                <w:szCs w:val="22"/>
+              </w:rPr>
+              <w:t>output_checkbox</w:t>
+            </w:r>
+            <w:proofErr w:type="spellEnd"/>
+            <w:r>
+              <w:rPr>
+                <w:rFonts w:ascii="Aptos" w:hAnsi="Aptos" w:eastAsia="Aptos" w:cs="Aptos"/>
+                <w:sz w:val="22"/>
+                <w:szCs w:val="22"/>
+              </w:rPr>
+              <w:t>(</w:t>
+            </w:r>
+            <w:proofErr w:type="spellStart"/>
+            <w:r>
+              <w:rPr>
+                <w:rFonts w:ascii="Aptos" w:hAnsi="Aptos" w:eastAsia="Aptos" w:cs="Aptos"/>
+                <w:sz w:val="22"/>
+                <w:szCs w:val="22"/>
+              </w:rPr>
+              <w:t>is_defendant</w:t>
+            </w:r>
+            <w:r>
+              <w:rPr>
+                <w:rFonts w:ascii="Aptos" w:hAnsi="Aptos" w:eastAsia="Aptos" w:cs="Aptos"/>
+                <w:sz w:val="22"/>
+                <w:szCs w:val="22"/>
+              </w:rPr>
+              <w:t>_</w:t>
+            </w:r>
+            <w:r>
+              <w:rPr>
+                <w:rFonts w:ascii="Aptos" w:hAnsi="Aptos" w:eastAsia="Aptos" w:cs="Aptos"/>
+                <w:sz w:val="22"/>
+                <w:szCs w:val="22"/>
+              </w:rPr>
+              <w:t>not</w:t>
+            </w:r>
+            <w:r>
+              <w:rPr>
+                <w:rFonts w:ascii="Aptos" w:hAnsi="Aptos" w:eastAsia="Aptos" w:cs="Aptos"/>
+                <w:sz w:val="22"/>
+                <w:szCs w:val="22"/>
+              </w:rPr>
+              <w:t>_need_</w:t>
+            </w:r>
+            <w:r>
+              <w:rPr>
+                <w:rFonts w:ascii="Aptos" w:hAnsi="Aptos" w:eastAsia="Aptos" w:cs="Aptos"/>
+                <w:sz w:val="22"/>
+                <w:szCs w:val="22"/>
+              </w:rPr>
+              <w:t>interpreter</w:t>
+            </w:r>
+            <w:proofErr w:type="spellEnd"/>
             <w:r>
               <w:rPr>
                 <w:rFonts w:ascii="Aptos" w:hAnsi="Aptos" w:eastAsia="Aptos" w:cs="Aptos"/>
@@ -5706,94 +5830,7 @@
                 <w:sz w:val="22"/>
                 <w:szCs w:val="22"/>
               </w:rPr>
-              <w:t xml:space="preserve"> }</w:t>
-            </w:r>
-            <w:r>
-              <w:rPr>
-                <w:rFonts w:ascii="Aptos" w:hAnsi="Aptos" w:eastAsia="Aptos" w:cs="Aptos"/>
-                <w:sz w:val="22"/>
-                <w:szCs w:val="22"/>
-              </w:rPr>
-              <w:t>}</w:t>
-            </w:r>
-          </w:p>
-          <w:p>
-            <w:pPr>
-              <w:pStyle w:val="NoSpacing"/>
-              <w:rPr>
-                <w:sz w:val="22"/>
-                <w:szCs w:val="22"/>
-              </w:rPr>
-            </w:pPr>
-            <w:r>
-              <w:rPr>
-                <w:rFonts w:ascii="Tahoma" w:hAnsi="Tahoma" w:cs="Tahoma"/>
-                <w:sz w:val="22"/>
-                <w:szCs w:val="22"/>
-              </w:rPr>
-              <w:t xml:space="preserve"> </w:t>
-            </w:r>
-            <w:r>
-              <w:rPr>
-                <w:sz w:val="22"/>
-                <w:szCs w:val="22"/>
-              </w:rPr>
-              <w:t>No</w:t>
-            </w:r>
-            <w:r>
-              <w:rPr>
-                <w:sz w:val="22"/>
-                <w:szCs w:val="22"/>
-              </w:rPr>
-              <w:t xml:space="preserve"> </w:t>
-            </w:r>
-            <w:r>
-              <w:rPr>
-                <w:rFonts w:ascii="Aptos" w:hAnsi="Aptos" w:eastAsia="Aptos" w:cs="Aptos"/>
-                <w:sz w:val="22"/>
-                <w:szCs w:val="22"/>
-              </w:rPr>
-              <w:t>{</w:t>
-            </w:r>
-            <w:r>
-              <w:rPr>
-                <w:rFonts w:ascii="Aptos" w:hAnsi="Aptos" w:eastAsia="Aptos" w:cs="Aptos"/>
-                <w:sz w:val="22"/>
-                <w:szCs w:val="22"/>
-              </w:rPr>
-              <w:t xml:space="preserve">{ </w:t>
-            </w:r>
-            <w:r>
-              <w:rPr>
-                <w:rFonts w:ascii="Aptos" w:hAnsi="Aptos" w:eastAsia="Aptos" w:cs="Aptos"/>
-                <w:sz w:val="22"/>
-                <w:szCs w:val="22"/>
-              </w:rPr>
-              <w:t>output_checkbox(is_defendant_not_need_interpreter</w:t>
-            </w:r>
-            <w:r>
-              <w:rPr>
-                <w:rFonts w:ascii="Aptos" w:hAnsi="Aptos" w:eastAsia="Aptos" w:cs="Aptos"/>
-                <w:sz w:val="22"/>
-                <w:szCs w:val="22"/>
-              </w:rPr>
-              <w:t>)</w:t>
-            </w:r>
-            <w:r>
-              <w:rPr>
-                <w:rFonts w:ascii="Aptos" w:hAnsi="Aptos" w:eastAsia="Aptos" w:cs="Aptos"/>
-                <w:sz w:val="22"/>
-                <w:szCs w:val="22"/>
-              </w:rPr>
-              <w:t xml:space="preserve"> }</w:t>
-            </w:r>
-            <w:r>
-              <w:rPr>
-                <w:rFonts w:ascii="Aptos" w:hAnsi="Aptos" w:eastAsia="Aptos" w:cs="Aptos"/>
-                <w:sz w:val="22"/>
-                <w:szCs w:val="22"/>
-              </w:rPr>
-              <w:t>}</w:t>
+              <w:t xml:space="preserve"> }}</w:t>
             </w:r>
           </w:p>
           <w:p>
@@ -9727,23 +9764,31 @@
                 <w:sz w:val="22"/>
                 <w:szCs w:val="22"/>
               </w:rPr>
-              <w:t>output_checkbox</w:t>
-            </w:r>
-            <w:r>
-              <w:rPr>
-                <w:rFonts w:ascii="Aptos" w:hAnsi="Aptos" w:eastAsia="Aptos" w:cs="Aptos"/>
-                <w:sz w:val="22"/>
-                <w:szCs w:val="22"/>
-              </w:rPr>
-              <w:t>(</w:t>
-            </w:r>
-            <w:r>
-              <w:rPr>
-                <w:rFonts w:ascii="Aptos" w:hAnsi="Aptos" w:eastAsia="Aptos" w:cs="Aptos"/>
-                <w:sz w:val="22"/>
-                <w:szCs w:val="22"/>
-              </w:rPr>
-              <w:t>is_protected_need_interpreter</w:t>
+              <w:t>output_checkbox(</w:t>
+            </w:r>
+            <w:r>
+              <w:rPr>
+                <w:rFonts w:ascii="Aptos" w:hAnsi="Aptos" w:eastAsia="Aptos" w:cs="Aptos"/>
+                <w:sz w:val="22"/>
+                <w:szCs w:val="22"/>
+              </w:rPr>
+              <w:t>is_protected</w:t>
+            </w:r>
+            <w:r>
+              <w:rPr>
+                <w:rFonts w:ascii="Aptos" w:hAnsi="Aptos" w:eastAsia="Aptos" w:cs="Aptos"/>
+                <w:sz w:val="22"/>
+                <w:szCs w:val="22"/>
+              </w:rPr>
+              <w:t>_need_</w:t>
+            </w:r>
+            <w:r>
+              <w:rPr>
+                <w:rFonts w:ascii="Aptos" w:hAnsi="Aptos" w:eastAsia="Aptos" w:cs="Aptos"/>
+                <w:sz w:val="22"/>
+                <w:szCs w:val="22"/>
+              </w:rPr>
+              <w:t>interpreter</w:t>
             </w:r>
             <w:r>
               <w:rPr>
@@ -9759,15 +9804,7 @@
                 <w:sz w:val="22"/>
                 <w:szCs w:val="22"/>
               </w:rPr>
-              <w:t xml:space="preserve"> }</w:t>
-            </w:r>
-            <w:r>
-              <w:rPr>
-                <w:rFonts w:ascii="Aptos" w:hAnsi="Aptos" w:eastAsia="Aptos" w:cs="Aptos"/>
-                <w:sz w:val="22"/>
-                <w:szCs w:val="22"/>
-              </w:rPr>
-              <w:t>}</w:t>
+              <w:t xml:space="preserve"> }}</w:t>
             </w:r>
           </w:p>
           <w:p>
@@ -9823,23 +9860,55 @@
                 <w:sz w:val="22"/>
                 <w:szCs w:val="22"/>
               </w:rPr>
-              <w:t>output_checkbox</w:t>
-            </w:r>
-            <w:r>
-              <w:rPr>
-                <w:rFonts w:ascii="Aptos" w:hAnsi="Aptos" w:eastAsia="Aptos" w:cs="Aptos"/>
-                <w:sz w:val="22"/>
-                <w:szCs w:val="22"/>
-              </w:rPr>
-              <w:t>(</w:t>
-            </w:r>
-            <w:r>
-              <w:rPr>
-                <w:rFonts w:ascii="Aptos" w:hAnsi="Aptos" w:eastAsia="Aptos" w:cs="Aptos"/>
-                <w:sz w:val="22"/>
-                <w:szCs w:val="22"/>
-              </w:rPr>
-              <w:t>is_protected_not_need_interpreter</w:t>
+              <w:t>output_checkbox(</w:t>
+            </w:r>
+            <w:r>
+              <w:rPr>
+                <w:rFonts w:ascii="Aptos" w:hAnsi="Aptos" w:eastAsia="Aptos" w:cs="Aptos"/>
+                <w:sz w:val="22"/>
+                <w:szCs w:val="22"/>
+              </w:rPr>
+              <w:t>is_protected</w:t>
+            </w:r>
+            <w:r>
+              <w:rPr>
+                <w:rFonts w:ascii="Aptos" w:hAnsi="Aptos" w:eastAsia="Aptos" w:cs="Aptos"/>
+                <w:sz w:val="22"/>
+                <w:szCs w:val="22"/>
+              </w:rPr>
+              <w:t>_</w:t>
+            </w:r>
+            <w:r>
+              <w:rPr>
+                <w:rFonts w:ascii="Aptos" w:hAnsi="Aptos" w:eastAsia="Aptos" w:cs="Aptos"/>
+                <w:sz w:val="22"/>
+                <w:szCs w:val="22"/>
+              </w:rPr>
+              <w:t>not</w:t>
+            </w:r>
+            <w:r>
+              <w:rPr>
+                <w:rFonts w:ascii="Aptos" w:hAnsi="Aptos" w:eastAsia="Aptos" w:cs="Aptos"/>
+                <w:sz w:val="22"/>
+                <w:szCs w:val="22"/>
+              </w:rPr>
+              <w:t>_</w:t>
+            </w:r>
+            <w:r>
+              <w:rPr>
+                <w:rFonts w:ascii="Aptos" w:hAnsi="Aptos" w:eastAsia="Aptos" w:cs="Aptos"/>
+                <w:sz w:val="22"/>
+                <w:szCs w:val="22"/>
+              </w:rPr>
+              <w:t>need_</w:t>
+            </w:r>
+            <w:r>
+              <w:rPr>
+                <w:rFonts w:ascii="Aptos" w:hAnsi="Aptos" w:eastAsia="Aptos" w:cs="Aptos"/>
+                <w:sz w:val="22"/>
+                <w:szCs w:val="22"/>
+              </w:rPr>
+              <w:t>interpreter</w:t>
             </w:r>
             <w:r>
               <w:rPr>
@@ -9855,15 +9924,7 @@
                 <w:sz w:val="22"/>
                 <w:szCs w:val="22"/>
               </w:rPr>
-              <w:t xml:space="preserve"> }</w:t>
-            </w:r>
-            <w:r>
-              <w:rPr>
-                <w:rFonts w:ascii="Aptos" w:hAnsi="Aptos" w:eastAsia="Aptos" w:cs="Aptos"/>
-                <w:sz w:val="22"/>
-                <w:szCs w:val="22"/>
-              </w:rPr>
-              <w:t>}</w:t>
+              <w:t xml:space="preserve"> }}</w:t>
             </w:r>
           </w:p>
           <w:p>

</xml_diff>